<commit_message>
Fixed bugs within Ty's code, at least ones I have identified: - Changed accuracy thresholds for mistype and burnout events - Changed code to reset all typists - Added code to print the winners name - Modified the calculation to calculate when a typist should mistype - Modified the condition to check if a typist has finished the race - Modified the burnt out logo - Modified a misleading comment in printSeat - Added a way to show if a typist has just mistyped, and put a marker next to their symbol
</commit_message>
<xml_diff>
--- a/Part1/OOP Typing Race Simulator Part 1 Report.docx
+++ b/Part1/OOP Typing Race Simulator Part 1 Report.docx
@@ -22,6 +22,23 @@
     <w:p>
       <w:pPr>
         <w:rPr>
+          <w:sz w:val="30"/>
+          <w:szCs w:val="30"/>
+          <w:u w:val="single"/>
+        </w:rPr>
+      </w:pPr>
+      <w:r>
+        <w:rPr>
+          <w:sz w:val="30"/>
+          <w:szCs w:val="30"/>
+          <w:u w:val="single"/>
+        </w:rPr>
+        <w:t>Task 1:</w:t>
+      </w:r>
+    </w:p>
+    <w:p>
+      <w:pPr>
+        <w:rPr>
           <w:sz w:val="28"/>
           <w:szCs w:val="28"/>
           <w:u w:val="single"/>
@@ -59,7 +76,6 @@
       <w:r>
         <w:tab/>
       </w:r>
-      <w:proofErr w:type="spellStart"/>
       <w:r>
         <w:rPr>
           <w:sz w:val="22"/>
@@ -67,7 +83,6 @@
         </w:rPr>
         <w:t>getAccuracy</w:t>
       </w:r>
-      <w:proofErr w:type="spellEnd"/>
     </w:p>
     <w:p>
       <w:pPr>
@@ -82,16 +97,8 @@
           <w:szCs w:val="22"/>
         </w:rPr>
         <w:tab/>
-      </w:r>
-      <w:proofErr w:type="spellStart"/>
-      <w:r>
-        <w:rPr>
-          <w:sz w:val="22"/>
-          <w:szCs w:val="22"/>
-        </w:rPr>
         <w:t>getProgress</w:t>
       </w:r>
-      <w:proofErr w:type="spellEnd"/>
     </w:p>
     <w:p>
       <w:pPr>
@@ -106,16 +113,8 @@
           <w:szCs w:val="22"/>
         </w:rPr>
         <w:tab/>
-      </w:r>
-      <w:proofErr w:type="spellStart"/>
-      <w:r>
-        <w:rPr>
-          <w:sz w:val="22"/>
-          <w:szCs w:val="22"/>
-        </w:rPr>
         <w:t>getName</w:t>
       </w:r>
-      <w:proofErr w:type="spellEnd"/>
     </w:p>
     <w:p>
       <w:pPr>
@@ -130,16 +129,8 @@
           <w:szCs w:val="22"/>
         </w:rPr>
         <w:tab/>
-      </w:r>
-      <w:proofErr w:type="spellStart"/>
-      <w:r>
-        <w:rPr>
-          <w:sz w:val="22"/>
-          <w:szCs w:val="22"/>
-        </w:rPr>
         <w:t>getSymbol</w:t>
       </w:r>
-      <w:proofErr w:type="spellEnd"/>
     </w:p>
     <w:p>
       <w:pPr>
@@ -154,16 +145,8 @@
           <w:szCs w:val="22"/>
         </w:rPr>
         <w:tab/>
-      </w:r>
-      <w:proofErr w:type="spellStart"/>
-      <w:r>
-        <w:rPr>
-          <w:sz w:val="22"/>
-          <w:szCs w:val="22"/>
-        </w:rPr>
         <w:t>getBurnoutTurnsRemaining</w:t>
       </w:r>
-      <w:proofErr w:type="spellEnd"/>
     </w:p>
     <w:p>
       <w:pPr>
@@ -178,16 +161,8 @@
           <w:szCs w:val="22"/>
         </w:rPr>
         <w:tab/>
-      </w:r>
-      <w:proofErr w:type="spellStart"/>
-      <w:r>
-        <w:rPr>
-          <w:sz w:val="22"/>
-          <w:szCs w:val="22"/>
-        </w:rPr>
         <w:t>isBurntOut</w:t>
       </w:r>
-      <w:proofErr w:type="spellEnd"/>
     </w:p>
     <w:p>
       <w:pPr>
@@ -215,16 +190,8 @@
           <w:szCs w:val="22"/>
         </w:rPr>
         <w:tab/>
-      </w:r>
-      <w:proofErr w:type="spellStart"/>
-      <w:r>
-        <w:rPr>
-          <w:sz w:val="22"/>
-          <w:szCs w:val="22"/>
-        </w:rPr>
         <w:t>burnOut</w:t>
       </w:r>
-      <w:proofErr w:type="spellEnd"/>
     </w:p>
     <w:p>
       <w:pPr>
@@ -239,16 +206,8 @@
           <w:szCs w:val="22"/>
         </w:rPr>
         <w:tab/>
-      </w:r>
-      <w:proofErr w:type="spellStart"/>
-      <w:r>
-        <w:rPr>
-          <w:sz w:val="22"/>
-          <w:szCs w:val="22"/>
-        </w:rPr>
         <w:t>recoverFromBurnOut</w:t>
       </w:r>
-      <w:proofErr w:type="spellEnd"/>
     </w:p>
     <w:p>
       <w:pPr>
@@ -263,16 +222,8 @@
           <w:szCs w:val="22"/>
         </w:rPr>
         <w:tab/>
-      </w:r>
-      <w:proofErr w:type="spellStart"/>
-      <w:r>
-        <w:rPr>
-          <w:sz w:val="22"/>
-          <w:szCs w:val="22"/>
-        </w:rPr>
         <w:t>resetToStart</w:t>
       </w:r>
-      <w:proofErr w:type="spellEnd"/>
     </w:p>
     <w:p>
       <w:pPr>
@@ -287,16 +238,8 @@
           <w:szCs w:val="22"/>
         </w:rPr>
         <w:tab/>
-      </w:r>
-      <w:proofErr w:type="spellStart"/>
-      <w:r>
-        <w:rPr>
-          <w:sz w:val="22"/>
-          <w:szCs w:val="22"/>
-        </w:rPr>
         <w:t>typeCharacter</w:t>
       </w:r>
-      <w:proofErr w:type="spellEnd"/>
     </w:p>
     <w:p>
       <w:pPr>
@@ -311,16 +254,8 @@
           <w:szCs w:val="22"/>
         </w:rPr>
         <w:tab/>
-      </w:r>
-      <w:proofErr w:type="spellStart"/>
-      <w:r>
-        <w:rPr>
-          <w:sz w:val="22"/>
-          <w:szCs w:val="22"/>
-        </w:rPr>
         <w:t>slideBack</w:t>
       </w:r>
-      <w:proofErr w:type="spellEnd"/>
     </w:p>
     <w:p>
       <w:pPr>
@@ -335,16 +270,8 @@
           <w:szCs w:val="22"/>
         </w:rPr>
         <w:tab/>
-      </w:r>
-      <w:proofErr w:type="spellStart"/>
-      <w:r>
-        <w:rPr>
-          <w:sz w:val="22"/>
-          <w:szCs w:val="22"/>
-        </w:rPr>
         <w:t>setAccuracy</w:t>
       </w:r>
-      <w:proofErr w:type="spellEnd"/>
     </w:p>
     <w:p>
       <w:pPr>
@@ -359,16 +286,8 @@
           <w:szCs w:val="22"/>
         </w:rPr>
         <w:tab/>
-      </w:r>
-      <w:proofErr w:type="spellStart"/>
-      <w:r>
-        <w:rPr>
-          <w:sz w:val="22"/>
-          <w:szCs w:val="22"/>
-        </w:rPr>
         <w:t>setSymbol</w:t>
       </w:r>
-      <w:proofErr w:type="spellEnd"/>
     </w:p>
     <w:p>
       <w:pPr>
@@ -386,13 +305,8 @@
       </w:r>
     </w:p>
     <w:p>
-      <w:proofErr w:type="spellStart"/>
-      <w:r>
-        <w:t>slideBack</w:t>
-      </w:r>
-      <w:proofErr w:type="spellEnd"/>
-      <w:r>
-        <w:t xml:space="preserve"> validation logic:</w:t>
+      <w:r>
+        <w:t>slideBack validation logic:</w:t>
       </w:r>
     </w:p>
     <w:p>
@@ -435,47 +349,42 @@
       </w:r>
     </w:p>
     <w:p>
-      <w:proofErr w:type="spellStart"/>
-      <w:r>
-        <w:t>setAccuracy</w:t>
-      </w:r>
-      <w:proofErr w:type="spellEnd"/>
-      <w:r>
-        <w:t xml:space="preserve"> validation logic:</w:t>
-      </w:r>
-    </w:p>
-    <w:p>
-      <w:pPr>
-        <w:rPr>
-          <w:sz w:val="22"/>
-          <w:szCs w:val="22"/>
-        </w:rPr>
-      </w:pPr>
-      <w:r>
-        <w:tab/>
-      </w:r>
-      <w:r>
-        <w:rPr>
-          <w:sz w:val="22"/>
-          <w:szCs w:val="22"/>
-        </w:rPr>
-        <w:t>If the given new accuracy is below 0 then it sets the player’s accuracy to 0.</w:t>
-      </w:r>
-    </w:p>
-    <w:p>
-      <w:pPr>
-        <w:rPr>
-          <w:sz w:val="22"/>
-          <w:szCs w:val="22"/>
-        </w:rPr>
-      </w:pPr>
-      <w:r>
-        <w:rPr>
-          <w:sz w:val="22"/>
-          <w:szCs w:val="22"/>
-        </w:rPr>
+      <w:r>
+        <w:t>setAccuracy validation logic:</w:t>
+      </w:r>
+    </w:p>
+    <w:p>
+      <w:pPr>
+        <w:rPr>
+          <w:sz w:val="22"/>
+          <w:szCs w:val="22"/>
+        </w:rPr>
+      </w:pPr>
+      <w:r>
         <w:lastRenderedPageBreak/>
         <w:tab/>
+      </w:r>
+      <w:r>
+        <w:rPr>
+          <w:sz w:val="22"/>
+          <w:szCs w:val="22"/>
+        </w:rPr>
+        <w:t>If the given new accuracy is below 0 then it sets the player’s accuracy to 0.</w:t>
+      </w:r>
+    </w:p>
+    <w:p>
+      <w:pPr>
+        <w:rPr>
+          <w:sz w:val="22"/>
+          <w:szCs w:val="22"/>
+        </w:rPr>
+      </w:pPr>
+      <w:r>
+        <w:rPr>
+          <w:sz w:val="22"/>
+          <w:szCs w:val="22"/>
+        </w:rPr>
+        <w:tab/>
         <w:t>If the given new accuracy is above 1 then it sets the player’s accuracy to 1.</w:t>
       </w:r>
     </w:p>
@@ -492,21 +401,7 @@
           <w:sz w:val="22"/>
           <w:szCs w:val="22"/>
         </w:rPr>
-        <w:t xml:space="preserve">If none of those conditions are met, then it sets the </w:t>
-      </w:r>
-      <w:r>
-        <w:rPr>
-          <w:sz w:val="22"/>
-          <w:szCs w:val="22"/>
-        </w:rPr>
-        <w:t>player’s accuracy</w:t>
-      </w:r>
-      <w:r>
-        <w:rPr>
-          <w:sz w:val="22"/>
-          <w:szCs w:val="22"/>
-        </w:rPr>
-        <w:t xml:space="preserve"> to the given new accuracy</w:t>
+        <w:t>If none of those conditions are met, then it sets the player’s accuracy to the given new accuracy</w:t>
       </w:r>
       <w:r>
         <w:rPr>
@@ -539,14 +434,7 @@
           <w:sz w:val="22"/>
           <w:szCs w:val="22"/>
         </w:rPr>
-        <w:t xml:space="preserve"> </w:t>
-      </w:r>
-      <w:r>
-        <w:rPr>
-          <w:sz w:val="22"/>
-          <w:szCs w:val="22"/>
-        </w:rPr>
-        <w:t>it should not be possible to have an accuracy rating outside of these bounds.</w:t>
+        <w:t xml:space="preserve"> it should not be possible to have an accuracy rating outside of these bounds.</w:t>
       </w:r>
     </w:p>
     <w:p>
@@ -581,12 +469,55 @@
       </w:r>
     </w:p>
     <w:p>
-      <w:r>
-        <w:t>E</w:t>
-      </w:r>
-    </w:p>
-    <w:p>
-      <w:r>
+      <w:pPr>
+        <w:shd w:val="clear" w:color="auto" w:fill="FFFFFF"/>
+        <w:spacing w:line="285" w:lineRule="atLeast"/>
+        <w:rPr>
+          <w:rFonts w:ascii="Consolas" w:eastAsia="Times New Roman" w:hAnsi="Consolas" w:cs="Times New Roman"/>
+          <w:color w:val="3B3B3B"/>
+          <w:kern w:val="0"/>
+          <w:sz w:val="21"/>
+          <w:szCs w:val="21"/>
+          <w:lang w:eastAsia="en-GB"/>
+          <w14:ligatures w14:val="none"/>
+        </w:rPr>
+      </w:pPr>
+      <w:r>
+        <w:t xml:space="preserve">After running the </w:t>
+      </w:r>
+      <w:r>
+        <w:rPr>
+          <w:rFonts w:ascii="Consolas" w:eastAsia="Times New Roman" w:hAnsi="Consolas" w:cs="Times New Roman"/>
+          <w:color w:val="795E26"/>
+          <w:kern w:val="0"/>
+          <w:sz w:val="21"/>
+          <w:szCs w:val="21"/>
+          <w:lang w:eastAsia="en-GB"/>
+          <w14:ligatures w14:val="none"/>
+        </w:rPr>
+        <w:t>typeCharacter</w:t>
+      </w:r>
+      <w:r>
+        <w:rPr>
+          <w:rFonts w:ascii="Consolas" w:eastAsia="Times New Roman" w:hAnsi="Consolas" w:cs="Times New Roman"/>
+          <w:color w:val="3B3B3B"/>
+          <w:kern w:val="0"/>
+          <w:sz w:val="21"/>
+          <w:szCs w:val="21"/>
+          <w:lang w:eastAsia="en-GB"/>
+          <w14:ligatures w14:val="none"/>
+        </w:rPr>
+        <w:t>()</w:t>
+      </w:r>
+      <w:r>
+        <w:t xml:space="preserve"> command three times, the progress went up to 3 (from 0).</w:t>
+      </w:r>
+    </w:p>
+    <w:p>
+      <w:r>
+        <w:rPr>
+          <w:noProof/>
+        </w:rPr>
         <w:drawing>
           <wp:inline distT="0" distB="0" distL="0" distR="0" wp14:anchorId="7500AADF" wp14:editId="758DBE8F">
             <wp:extent cx="5731510" cy="1168400"/>
@@ -626,7 +557,70 @@
     </w:p>
     <w:p/>
     <w:p>
-      <w:r>
+      <w:pPr>
+        <w:shd w:val="clear" w:color="auto" w:fill="FFFFFF"/>
+        <w:spacing w:line="285" w:lineRule="atLeast"/>
+      </w:pPr>
+      <w:r>
+        <w:t xml:space="preserve">Calling </w:t>
+      </w:r>
+      <w:r>
+        <w:rPr>
+          <w:rFonts w:ascii="Consolas" w:eastAsia="Times New Roman" w:hAnsi="Consolas" w:cs="Times New Roman"/>
+          <w:color w:val="795E26"/>
+          <w:kern w:val="0"/>
+          <w:sz w:val="21"/>
+          <w:szCs w:val="21"/>
+          <w:lang w:eastAsia="en-GB"/>
+          <w14:ligatures w14:val="none"/>
+        </w:rPr>
+        <w:t>slideBack</w:t>
+      </w:r>
+      <w:r>
+        <w:rPr>
+          <w:rFonts w:ascii="Consolas" w:eastAsia="Times New Roman" w:hAnsi="Consolas" w:cs="Times New Roman"/>
+          <w:color w:val="3B3B3B"/>
+          <w:kern w:val="0"/>
+          <w:sz w:val="21"/>
+          <w:szCs w:val="21"/>
+          <w:lang w:eastAsia="en-GB"/>
+          <w14:ligatures w14:val="none"/>
+        </w:rPr>
+        <w:t>(</w:t>
+      </w:r>
+      <w:r>
+        <w:rPr>
+          <w:rFonts w:ascii="Consolas" w:eastAsia="Times New Roman" w:hAnsi="Consolas" w:cs="Times New Roman"/>
+          <w:color w:val="098658"/>
+          <w:kern w:val="0"/>
+          <w:sz w:val="21"/>
+          <w:szCs w:val="21"/>
+          <w:lang w:eastAsia="en-GB"/>
+          <w14:ligatures w14:val="none"/>
+        </w:rPr>
+        <w:t>5</w:t>
+      </w:r>
+      <w:r>
+        <w:rPr>
+          <w:rFonts w:ascii="Consolas" w:eastAsia="Times New Roman" w:hAnsi="Consolas" w:cs="Times New Roman"/>
+          <w:color w:val="3B3B3B"/>
+          <w:kern w:val="0"/>
+          <w:sz w:val="21"/>
+          <w:szCs w:val="21"/>
+          <w:lang w:eastAsia="en-GB"/>
+          <w14:ligatures w14:val="none"/>
+        </w:rPr>
+        <w:t>)</w:t>
+      </w:r>
+      <w:r>
+        <w:t>, the program only reset the progress to 0.</w:t>
+      </w:r>
+    </w:p>
+    <w:p>
+      <w:r>
+        <w:rPr>
+          <w:noProof/>
+        </w:rPr>
         <w:drawing>
           <wp:inline distT="0" distB="0" distL="0" distR="0" wp14:anchorId="2E8BF339" wp14:editId="76B3EBD4">
             <wp:extent cx="5731510" cy="1138555"/>
@@ -664,14 +658,115 @@
         </w:drawing>
       </w:r>
     </w:p>
-    <w:p/>
-    <w:p>
-      <w:r>
+    <w:p>
+      <w:pPr>
+        <w:shd w:val="clear" w:color="auto" w:fill="FFFFFF"/>
+        <w:spacing w:line="285" w:lineRule="atLeast"/>
+        <w:rPr>
+          <w:rFonts w:ascii="Consolas" w:eastAsia="Times New Roman" w:hAnsi="Consolas" w:cs="Times New Roman"/>
+          <w:color w:val="3B3B3B"/>
+          <w:kern w:val="0"/>
+          <w:sz w:val="21"/>
+          <w:szCs w:val="21"/>
+          <w:lang w:eastAsia="en-GB"/>
+          <w14:ligatures w14:val="none"/>
+        </w:rPr>
+      </w:pPr>
+      <w:r>
+        <w:t xml:space="preserve">Calling </w:t>
+      </w:r>
+      <w:r>
+        <w:rPr>
+          <w:rFonts w:ascii="Consolas" w:eastAsia="Times New Roman" w:hAnsi="Consolas" w:cs="Times New Roman"/>
+          <w:color w:val="795E26"/>
+          <w:kern w:val="0"/>
+          <w:sz w:val="21"/>
+          <w:szCs w:val="21"/>
+          <w:lang w:eastAsia="en-GB"/>
+          <w14:ligatures w14:val="none"/>
+        </w:rPr>
+        <w:t>burnOut</w:t>
+      </w:r>
+      <w:r>
+        <w:rPr>
+          <w:rFonts w:ascii="Consolas" w:eastAsia="Times New Roman" w:hAnsi="Consolas" w:cs="Times New Roman"/>
+          <w:color w:val="3B3B3B"/>
+          <w:kern w:val="0"/>
+          <w:sz w:val="21"/>
+          <w:szCs w:val="21"/>
+          <w:lang w:eastAsia="en-GB"/>
+          <w14:ligatures w14:val="none"/>
+        </w:rPr>
+        <w:t>(</w:t>
+      </w:r>
+      <w:r>
+        <w:rPr>
+          <w:rFonts w:ascii="Consolas" w:eastAsia="Times New Roman" w:hAnsi="Consolas" w:cs="Times New Roman"/>
+          <w:color w:val="098658"/>
+          <w:kern w:val="0"/>
+          <w:sz w:val="21"/>
+          <w:szCs w:val="21"/>
+          <w:lang w:eastAsia="en-GB"/>
+          <w14:ligatures w14:val="none"/>
+        </w:rPr>
+        <w:t>2</w:t>
+      </w:r>
+      <w:r>
+        <w:rPr>
+          <w:rFonts w:ascii="Consolas" w:eastAsia="Times New Roman" w:hAnsi="Consolas" w:cs="Times New Roman"/>
+          <w:color w:val="3B3B3B"/>
+          <w:kern w:val="0"/>
+          <w:sz w:val="21"/>
+          <w:szCs w:val="21"/>
+          <w:lang w:eastAsia="en-GB"/>
+          <w14:ligatures w14:val="none"/>
+        </w:rPr>
+        <w:t>)</w:t>
+      </w:r>
+      <w:r>
+        <w:t xml:space="preserve"> and</w:t>
+      </w:r>
+      <w:r>
+        <w:t xml:space="preserve"> </w:t>
+      </w:r>
+      <w:r>
+        <w:rPr>
+          <w:rFonts w:ascii="Consolas" w:eastAsia="Times New Roman" w:hAnsi="Consolas" w:cs="Times New Roman"/>
+          <w:color w:val="795E26"/>
+          <w:kern w:val="0"/>
+          <w:sz w:val="21"/>
+          <w:szCs w:val="21"/>
+          <w:lang w:eastAsia="en-GB"/>
+          <w14:ligatures w14:val="none"/>
+        </w:rPr>
+        <w:t>recoverFromBurnout</w:t>
+      </w:r>
+      <w:r>
+        <w:rPr>
+          <w:rFonts w:ascii="Consolas" w:eastAsia="Times New Roman" w:hAnsi="Consolas" w:cs="Times New Roman"/>
+          <w:color w:val="3B3B3B"/>
+          <w:kern w:val="0"/>
+          <w:sz w:val="21"/>
+          <w:szCs w:val="21"/>
+          <w:lang w:eastAsia="en-GB"/>
+          <w14:ligatures w14:val="none"/>
+        </w:rPr>
+        <w:t>()</w:t>
+      </w:r>
+      <w:r>
+        <w:t>:</w:t>
+      </w:r>
+    </w:p>
+    <w:p>
+      <w:r>
+        <w:rPr>
+          <w:noProof/>
+        </w:rPr>
         <w:lastRenderedPageBreak/>
         <w:drawing>
-          <wp:inline distT="0" distB="0" distL="0" distR="0" wp14:anchorId="627A59E5" wp14:editId="09DD8C59">
-            <wp:extent cx="5731510" cy="3013075"/>
-            <wp:effectExtent l="0" t="0" r="2540" b="0"/>
+          <wp:inline distT="0" distB="0" distL="0" distR="0" wp14:anchorId="627A59E5" wp14:editId="33D9E332">
+            <wp:extent cx="4553806" cy="2393950"/>
+            <wp:effectExtent l="0" t="0" r="0" b="6350"/>
             <wp:docPr id="1752618029" name="Picture 1"/>
             <wp:cNvGraphicFramePr>
               <a:graphicFrameLocks xmlns:a="http://schemas.openxmlformats.org/drawingml/2006/main" noChangeAspect="1"/>
@@ -692,7 +787,7 @@
                   <pic:spPr>
                     <a:xfrm>
                       <a:off x="0" y="0"/>
-                      <a:ext cx="5731510" cy="3013075"/>
+                      <a:ext cx="4587650" cy="2411742"/>
                     </a:xfrm>
                     <a:prstGeom prst="rect">
                       <a:avLst/>
@@ -707,7 +802,55 @@
     </w:p>
     <w:p/>
     <w:p>
-      <w:r>
+      <w:pPr>
+        <w:shd w:val="clear" w:color="auto" w:fill="FFFFFF"/>
+        <w:spacing w:line="285" w:lineRule="atLeast"/>
+        <w:rPr>
+          <w:rFonts w:ascii="Consolas" w:eastAsia="Times New Roman" w:hAnsi="Consolas" w:cs="Times New Roman"/>
+          <w:color w:val="3B3B3B"/>
+          <w:kern w:val="0"/>
+          <w:sz w:val="21"/>
+          <w:szCs w:val="21"/>
+          <w:lang w:eastAsia="en-GB"/>
+          <w14:ligatures w14:val="none"/>
+        </w:rPr>
+      </w:pPr>
+      <w:r>
+        <w:t xml:space="preserve">Continuing from the last test where the number of burnout turns remaining is 1, I ran this command </w:t>
+      </w:r>
+      <w:r>
+        <w:rPr>
+          <w:rFonts w:ascii="Consolas" w:eastAsia="Times New Roman" w:hAnsi="Consolas" w:cs="Times New Roman"/>
+          <w:color w:val="795E26"/>
+          <w:kern w:val="0"/>
+          <w:sz w:val="21"/>
+          <w:szCs w:val="21"/>
+          <w:lang w:eastAsia="en-GB"/>
+          <w14:ligatures w14:val="none"/>
+        </w:rPr>
+        <w:t>recoverFromBurnout</w:t>
+      </w:r>
+      <w:r>
+        <w:rPr>
+          <w:rFonts w:ascii="Consolas" w:eastAsia="Times New Roman" w:hAnsi="Consolas" w:cs="Times New Roman"/>
+          <w:color w:val="3B3B3B"/>
+          <w:kern w:val="0"/>
+          <w:sz w:val="21"/>
+          <w:szCs w:val="21"/>
+          <w:lang w:eastAsia="en-GB"/>
+          <w14:ligatures w14:val="none"/>
+        </w:rPr>
+        <w:t>()</w:t>
+      </w:r>
+      <w:r>
+        <w:t xml:space="preserve"> to reset the number of burnout terms to 0. </w:t>
+      </w:r>
+    </w:p>
+    <w:p>
+      <w:r>
+        <w:rPr>
+          <w:noProof/>
+        </w:rPr>
         <w:drawing>
           <wp:inline distT="0" distB="0" distL="0" distR="0" wp14:anchorId="78E2871B" wp14:editId="25662194">
             <wp:extent cx="3848637" cy="3305636"/>
@@ -747,13 +890,112 @@
     </w:p>
     <w:p/>
     <w:p>
-      <w:r>
+      <w:pPr>
+        <w:shd w:val="clear" w:color="auto" w:fill="FFFFFF"/>
+        <w:spacing w:line="285" w:lineRule="atLeast"/>
+        <w:rPr>
+          <w:rFonts w:ascii="Consolas" w:eastAsia="Times New Roman" w:hAnsi="Consolas" w:cs="Times New Roman"/>
+          <w:color w:val="202020"/>
+          <w:kern w:val="0"/>
+          <w:sz w:val="21"/>
+          <w:szCs w:val="21"/>
+          <w:lang w:eastAsia="en-GB"/>
+          <w14:ligatures w14:val="none"/>
+        </w:rPr>
+      </w:pPr>
+      <w:r>
+        <w:t xml:space="preserve">I ran </w:t>
+      </w:r>
+      <w:r>
+        <w:rPr>
+          <w:rFonts w:ascii="Consolas" w:eastAsia="Times New Roman" w:hAnsi="Consolas" w:cs="Times New Roman"/>
+          <w:color w:val="8250DF"/>
+          <w:kern w:val="0"/>
+          <w:sz w:val="21"/>
+          <w:szCs w:val="21"/>
+          <w:lang w:eastAsia="en-GB"/>
+          <w14:ligatures w14:val="none"/>
+        </w:rPr>
+        <w:t>typeCharacter</w:t>
+      </w:r>
+      <w:r>
+        <w:rPr>
+          <w:rFonts w:ascii="Consolas" w:eastAsia="Times New Roman" w:hAnsi="Consolas" w:cs="Times New Roman"/>
+          <w:color w:val="202020"/>
+          <w:kern w:val="0"/>
+          <w:sz w:val="21"/>
+          <w:szCs w:val="21"/>
+          <w:lang w:eastAsia="en-GB"/>
+          <w14:ligatures w14:val="none"/>
+        </w:rPr>
+        <w:t>()</w:t>
+      </w:r>
+      <w:r>
+        <w:t xml:space="preserve"> once as well as </w:t>
+      </w:r>
+      <w:r>
+        <w:rPr>
+          <w:rFonts w:ascii="Consolas" w:eastAsia="Times New Roman" w:hAnsi="Consolas" w:cs="Times New Roman"/>
+          <w:color w:val="8250DF"/>
+          <w:kern w:val="0"/>
+          <w:sz w:val="21"/>
+          <w:szCs w:val="21"/>
+          <w:lang w:eastAsia="en-GB"/>
+          <w14:ligatures w14:val="none"/>
+        </w:rPr>
+        <w:t>burnOut</w:t>
+      </w:r>
+      <w:r>
+        <w:rPr>
+          <w:rFonts w:ascii="Consolas" w:eastAsia="Times New Roman" w:hAnsi="Consolas" w:cs="Times New Roman"/>
+          <w:color w:val="202020"/>
+          <w:kern w:val="0"/>
+          <w:sz w:val="21"/>
+          <w:szCs w:val="21"/>
+          <w:lang w:eastAsia="en-GB"/>
+          <w14:ligatures w14:val="none"/>
+        </w:rPr>
+        <w:t>(</w:t>
+      </w:r>
+      <w:r>
+        <w:rPr>
+          <w:rFonts w:ascii="Consolas" w:eastAsia="Times New Roman" w:hAnsi="Consolas" w:cs="Times New Roman"/>
+          <w:color w:val="098658"/>
+          <w:kern w:val="0"/>
+          <w:sz w:val="21"/>
+          <w:szCs w:val="21"/>
+          <w:lang w:eastAsia="en-GB"/>
+          <w14:ligatures w14:val="none"/>
+        </w:rPr>
+        <w:t>1</w:t>
+      </w:r>
+      <w:r>
+        <w:rPr>
+          <w:rFonts w:ascii="Consolas" w:eastAsia="Times New Roman" w:hAnsi="Consolas" w:cs="Times New Roman"/>
+          <w:color w:val="202020"/>
+          <w:kern w:val="0"/>
+          <w:sz w:val="21"/>
+          <w:szCs w:val="21"/>
+          <w:lang w:eastAsia="en-GB"/>
+          <w14:ligatures w14:val="none"/>
+        </w:rPr>
+        <w:t>)</w:t>
+      </w:r>
+      <w:r>
+        <w:t xml:space="preserve"> to make the progress and burnout turns not zero before reset (to check that the reset actually works):</w:t>
+      </w:r>
+    </w:p>
+    <w:p>
+      <w:r>
+        <w:rPr>
+          <w:noProof/>
+        </w:rPr>
         <w:lastRenderedPageBreak/>
         <w:drawing>
-          <wp:inline distT="0" distB="0" distL="0" distR="0" wp14:anchorId="24724561" wp14:editId="0E611A94">
-            <wp:extent cx="5731510" cy="2494280"/>
-            <wp:effectExtent l="0" t="0" r="2540" b="1270"/>
-            <wp:docPr id="1902448075" name="Picture 1"/>
+          <wp:inline distT="0" distB="0" distL="0" distR="0" wp14:anchorId="33BB6FA1" wp14:editId="0C03FDFA">
+            <wp:extent cx="5731510" cy="4939030"/>
+            <wp:effectExtent l="0" t="0" r="2540" b="0"/>
+            <wp:docPr id="1552019398" name="Picture 1"/>
             <wp:cNvGraphicFramePr>
               <a:graphicFrameLocks xmlns:a="http://schemas.openxmlformats.org/drawingml/2006/main" noChangeAspect="1"/>
             </wp:cNvGraphicFramePr>
@@ -761,7 +1003,7 @@
               <a:graphicData uri="http://schemas.openxmlformats.org/drawingml/2006/picture">
                 <pic:pic xmlns:pic="http://schemas.openxmlformats.org/drawingml/2006/picture">
                   <pic:nvPicPr>
-                    <pic:cNvPr id="1902448075" name=""/>
+                    <pic:cNvPr id="1552019398" name=""/>
                     <pic:cNvPicPr/>
                   </pic:nvPicPr>
                   <pic:blipFill>
@@ -773,7 +1015,7 @@
                   <pic:spPr>
                     <a:xfrm>
                       <a:off x="0" y="0"/>
-                      <a:ext cx="5731510" cy="2494280"/>
+                      <a:ext cx="5731510" cy="4939030"/>
                     </a:xfrm>
                     <a:prstGeom prst="rect">
                       <a:avLst/>
@@ -788,7 +1030,142 @@
     </w:p>
     <w:p/>
     <w:p>
-      <w:r>
+      <w:pPr>
+        <w:shd w:val="clear" w:color="auto" w:fill="FFFFFF"/>
+        <w:spacing w:line="285" w:lineRule="atLeast"/>
+        <w:rPr>
+          <w:rFonts w:ascii="Consolas" w:eastAsia="Times New Roman" w:hAnsi="Consolas" w:cs="Times New Roman"/>
+          <w:color w:val="202020"/>
+          <w:kern w:val="0"/>
+          <w:sz w:val="21"/>
+          <w:szCs w:val="21"/>
+          <w:lang w:eastAsia="en-GB"/>
+          <w14:ligatures w14:val="none"/>
+        </w:rPr>
+      </w:pPr>
+      <w:r>
+        <w:t xml:space="preserve">I ran </w:t>
+      </w:r>
+      <w:r>
+        <w:rPr>
+          <w:rFonts w:ascii="Consolas" w:eastAsia="Times New Roman" w:hAnsi="Consolas" w:cs="Times New Roman"/>
+          <w:color w:val="8250DF"/>
+          <w:kern w:val="0"/>
+          <w:sz w:val="21"/>
+          <w:szCs w:val="21"/>
+          <w:lang w:eastAsia="en-GB"/>
+          <w14:ligatures w14:val="none"/>
+        </w:rPr>
+        <w:t>setAccuracy</w:t>
+      </w:r>
+      <w:r>
+        <w:rPr>
+          <w:rFonts w:ascii="Consolas" w:eastAsia="Times New Roman" w:hAnsi="Consolas" w:cs="Times New Roman"/>
+          <w:color w:val="202020"/>
+          <w:kern w:val="0"/>
+          <w:sz w:val="21"/>
+          <w:szCs w:val="21"/>
+          <w:lang w:eastAsia="en-GB"/>
+          <w14:ligatures w14:val="none"/>
+        </w:rPr>
+        <w:t>(</w:t>
+      </w:r>
+      <w:r>
+        <w:rPr>
+          <w:rFonts w:ascii="Consolas" w:eastAsia="Times New Roman" w:hAnsi="Consolas" w:cs="Times New Roman"/>
+          <w:color w:val="000000"/>
+          <w:kern w:val="0"/>
+          <w:sz w:val="21"/>
+          <w:szCs w:val="21"/>
+          <w:lang w:eastAsia="en-GB"/>
+          <w14:ligatures w14:val="none"/>
+        </w:rPr>
+        <w:t>-</w:t>
+      </w:r>
+      <w:r>
+        <w:rPr>
+          <w:rFonts w:ascii="Consolas" w:eastAsia="Times New Roman" w:hAnsi="Consolas" w:cs="Times New Roman"/>
+          <w:color w:val="098658"/>
+          <w:kern w:val="0"/>
+          <w:sz w:val="21"/>
+          <w:szCs w:val="21"/>
+          <w:lang w:eastAsia="en-GB"/>
+          <w14:ligatures w14:val="none"/>
+        </w:rPr>
+        <w:t>0.3</w:t>
+      </w:r>
+      <w:r>
+        <w:rPr>
+          <w:rFonts w:ascii="Consolas" w:eastAsia="Times New Roman" w:hAnsi="Consolas" w:cs="Times New Roman"/>
+          <w:color w:val="202020"/>
+          <w:kern w:val="0"/>
+          <w:sz w:val="21"/>
+          <w:szCs w:val="21"/>
+          <w:lang w:eastAsia="en-GB"/>
+          <w14:ligatures w14:val="none"/>
+        </w:rPr>
+        <w:t>)</w:t>
+      </w:r>
+      <w:r>
+        <w:t xml:space="preserve"> before testing the first case, since -0.3 is below 0.0, and then ran </w:t>
+      </w:r>
+      <w:r>
+        <w:rPr>
+          <w:rFonts w:ascii="Consolas" w:eastAsia="Times New Roman" w:hAnsi="Consolas" w:cs="Times New Roman"/>
+          <w:color w:val="8250DF"/>
+          <w:kern w:val="0"/>
+          <w:sz w:val="21"/>
+          <w:szCs w:val="21"/>
+          <w:lang w:eastAsia="en-GB"/>
+          <w14:ligatures w14:val="none"/>
+        </w:rPr>
+        <w:t>setAccuracy</w:t>
+      </w:r>
+      <w:r>
+        <w:rPr>
+          <w:rFonts w:ascii="Consolas" w:eastAsia="Times New Roman" w:hAnsi="Consolas" w:cs="Times New Roman"/>
+          <w:color w:val="202020"/>
+          <w:kern w:val="0"/>
+          <w:sz w:val="21"/>
+          <w:szCs w:val="21"/>
+          <w:lang w:eastAsia="en-GB"/>
+          <w14:ligatures w14:val="none"/>
+        </w:rPr>
+        <w:t>(</w:t>
+      </w:r>
+      <w:r>
+        <w:rPr>
+          <w:rFonts w:ascii="Consolas" w:eastAsia="Times New Roman" w:hAnsi="Consolas" w:cs="Times New Roman"/>
+          <w:color w:val="098658"/>
+          <w:kern w:val="0"/>
+          <w:sz w:val="21"/>
+          <w:szCs w:val="21"/>
+          <w:lang w:eastAsia="en-GB"/>
+          <w14:ligatures w14:val="none"/>
+        </w:rPr>
+        <w:t>1.7</w:t>
+      </w:r>
+      <w:r>
+        <w:rPr>
+          <w:rFonts w:ascii="Consolas" w:eastAsia="Times New Roman" w:hAnsi="Consolas" w:cs="Times New Roman"/>
+          <w:color w:val="202020"/>
+          <w:kern w:val="0"/>
+          <w:sz w:val="21"/>
+          <w:szCs w:val="21"/>
+          <w:lang w:eastAsia="en-GB"/>
+          <w14:ligatures w14:val="none"/>
+        </w:rPr>
+        <w:t>)</w:t>
+      </w:r>
+      <w:r>
+        <w:t xml:space="preserve"> before testing the second case since 1.7 is above 1.0</w:t>
+      </w:r>
+    </w:p>
+    <w:p>
+      <w:r>
+        <w:rPr>
+          <w:noProof/>
+        </w:rPr>
         <w:drawing>
           <wp:inline distT="0" distB="0" distL="0" distR="0" wp14:anchorId="4874852F" wp14:editId="629DFBD7">
             <wp:extent cx="5731510" cy="2441575"/>
@@ -826,8 +1203,1366 @@
         </w:drawing>
       </w:r>
     </w:p>
+    <w:p/>
+    <w:p>
+      <w:pPr>
+        <w:rPr>
+          <w:sz w:val="30"/>
+          <w:szCs w:val="30"/>
+          <w:u w:val="single"/>
+        </w:rPr>
+      </w:pPr>
+      <w:r>
+        <w:rPr>
+          <w:sz w:val="30"/>
+          <w:szCs w:val="30"/>
+          <w:u w:val="single"/>
+        </w:rPr>
+        <w:lastRenderedPageBreak/>
+        <w:t>Task 2:</w:t>
+      </w:r>
+    </w:p>
+    <w:p>
+      <w:pPr>
+        <w:rPr>
+          <w:sz w:val="28"/>
+          <w:szCs w:val="28"/>
+          <w:u w:val="single"/>
+        </w:rPr>
+      </w:pPr>
+      <w:r>
+        <w:rPr>
+          <w:sz w:val="28"/>
+          <w:szCs w:val="28"/>
+          <w:u w:val="single"/>
+        </w:rPr>
+        <w:t>Errors:</w:t>
+      </w:r>
+    </w:p>
+    <w:p>
+      <w:r>
+        <w:rPr>
+          <w:noProof/>
+        </w:rPr>
+        <w:drawing>
+          <wp:inline distT="0" distB="0" distL="0" distR="0" wp14:anchorId="4FB71972" wp14:editId="3E581C61">
+            <wp:extent cx="5731510" cy="1493520"/>
+            <wp:effectExtent l="0" t="0" r="2540" b="0"/>
+            <wp:docPr id="2084214274" name="Picture 1"/>
+            <wp:cNvGraphicFramePr>
+              <a:graphicFrameLocks xmlns:a="http://schemas.openxmlformats.org/drawingml/2006/main" noChangeAspect="1"/>
+            </wp:cNvGraphicFramePr>
+            <a:graphic xmlns:a="http://schemas.openxmlformats.org/drawingml/2006/main">
+              <a:graphicData uri="http://schemas.openxmlformats.org/drawingml/2006/picture">
+                <pic:pic xmlns:pic="http://schemas.openxmlformats.org/drawingml/2006/picture">
+                  <pic:nvPicPr>
+                    <pic:cNvPr id="2084214274" name=""/>
+                    <pic:cNvPicPr/>
+                  </pic:nvPicPr>
+                  <pic:blipFill>
+                    <a:blip r:embed="rId12"/>
+                    <a:stretch>
+                      <a:fillRect/>
+                    </a:stretch>
+                  </pic:blipFill>
+                  <pic:spPr>
+                    <a:xfrm>
+                      <a:off x="0" y="0"/>
+                      <a:ext cx="5731510" cy="1493520"/>
+                    </a:xfrm>
+                    <a:prstGeom prst="rect">
+                      <a:avLst/>
+                    </a:prstGeom>
+                  </pic:spPr>
+                </pic:pic>
+              </a:graphicData>
+            </a:graphic>
+          </wp:inline>
+        </w:drawing>
+      </w:r>
+    </w:p>
+    <w:p>
+      <w:r>
+        <w:t>The mistype base chance seems to be okay</w:t>
+      </w:r>
+      <w:r>
+        <w:t>. In the screenshot from the specification, it seemed like “QWERTY_QUEEN” slided back 2 spaces after mistyping so I will keep the slide back amount to 2</w:t>
+      </w:r>
+      <w:r>
+        <w:t>. Furthermore, I decreased the burnout duration to 2 since</w:t>
+      </w:r>
+      <w:r>
+        <w:t xml:space="preserve"> in the screenshot from the specification, “HUNT_N_PECK” is burnt out for 2 turns</w:t>
+      </w:r>
+      <w:r>
+        <w:t>.</w:t>
+      </w:r>
+    </w:p>
+    <w:p>
+      <w:r>
+        <w:t>My code:</w:t>
+      </w:r>
+    </w:p>
+    <w:p>
+      <w:pPr>
+        <w:pBdr>
+          <w:bottom w:val="single" w:sz="6" w:space="1" w:color="auto"/>
+        </w:pBdr>
+      </w:pPr>
+      <w:r>
+        <w:rPr>
+          <w:noProof/>
+        </w:rPr>
+        <w:drawing>
+          <wp:inline distT="0" distB="0" distL="0" distR="0" wp14:anchorId="6533FA6A" wp14:editId="63517594">
+            <wp:extent cx="5731510" cy="1130935"/>
+            <wp:effectExtent l="0" t="0" r="2540" b="0"/>
+            <wp:docPr id="1875877280" name="Picture 1"/>
+            <wp:cNvGraphicFramePr>
+              <a:graphicFrameLocks xmlns:a="http://schemas.openxmlformats.org/drawingml/2006/main" noChangeAspect="1"/>
+            </wp:cNvGraphicFramePr>
+            <a:graphic xmlns:a="http://schemas.openxmlformats.org/drawingml/2006/main">
+              <a:graphicData uri="http://schemas.openxmlformats.org/drawingml/2006/picture">
+                <pic:pic xmlns:pic="http://schemas.openxmlformats.org/drawingml/2006/picture">
+                  <pic:nvPicPr>
+                    <pic:cNvPr id="1875877280" name=""/>
+                    <pic:cNvPicPr/>
+                  </pic:nvPicPr>
+                  <pic:blipFill>
+                    <a:blip r:embed="rId13"/>
+                    <a:stretch>
+                      <a:fillRect/>
+                    </a:stretch>
+                  </pic:blipFill>
+                  <pic:spPr>
+                    <a:xfrm>
+                      <a:off x="0" y="0"/>
+                      <a:ext cx="5731510" cy="1130935"/>
+                    </a:xfrm>
+                    <a:prstGeom prst="rect">
+                      <a:avLst/>
+                    </a:prstGeom>
+                  </pic:spPr>
+                </pic:pic>
+              </a:graphicData>
+            </a:graphic>
+          </wp:inline>
+        </w:drawing>
+      </w:r>
+    </w:p>
+    <w:p>
+      <w:pPr>
+        <w:pBdr>
+          <w:bottom w:val="single" w:sz="6" w:space="1" w:color="auto"/>
+        </w:pBdr>
+      </w:pPr>
+    </w:p>
+    <w:p/>
+    <w:p>
+      <w:r>
+        <w:rPr>
+          <w:noProof/>
+        </w:rPr>
+        <w:drawing>
+          <wp:inline distT="0" distB="0" distL="0" distR="0" wp14:anchorId="04C7FA2A" wp14:editId="06D4D396">
+            <wp:extent cx="5363323" cy="1448002"/>
+            <wp:effectExtent l="0" t="0" r="8890" b="0"/>
+            <wp:docPr id="282156432" name="Picture 1"/>
+            <wp:cNvGraphicFramePr>
+              <a:graphicFrameLocks xmlns:a="http://schemas.openxmlformats.org/drawingml/2006/main" noChangeAspect="1"/>
+            </wp:cNvGraphicFramePr>
+            <a:graphic xmlns:a="http://schemas.openxmlformats.org/drawingml/2006/main">
+              <a:graphicData uri="http://schemas.openxmlformats.org/drawingml/2006/picture">
+                <pic:pic xmlns:pic="http://schemas.openxmlformats.org/drawingml/2006/picture">
+                  <pic:nvPicPr>
+                    <pic:cNvPr id="282156432" name=""/>
+                    <pic:cNvPicPr/>
+                  </pic:nvPicPr>
+                  <pic:blipFill>
+                    <a:blip r:embed="rId14"/>
+                    <a:stretch>
+                      <a:fillRect/>
+                    </a:stretch>
+                  </pic:blipFill>
+                  <pic:spPr>
+                    <a:xfrm>
+                      <a:off x="0" y="0"/>
+                      <a:ext cx="5363323" cy="1448002"/>
+                    </a:xfrm>
+                    <a:prstGeom prst="rect">
+                      <a:avLst/>
+                    </a:prstGeom>
+                  </pic:spPr>
+                </pic:pic>
+              </a:graphicData>
+            </a:graphic>
+          </wp:inline>
+        </w:drawing>
+      </w:r>
+    </w:p>
+    <w:p>
+      <w:r>
+        <w:t>He didn’t reset seat3Typist.</w:t>
+      </w:r>
+    </w:p>
+    <w:p>
+      <w:r>
+        <w:t>My code:</w:t>
+      </w:r>
+    </w:p>
+    <w:p>
+      <w:pPr>
+        <w:pBdr>
+          <w:bottom w:val="single" w:sz="6" w:space="1" w:color="auto"/>
+        </w:pBdr>
+      </w:pPr>
+      <w:r>
+        <w:rPr>
+          <w:noProof/>
+        </w:rPr>
+        <w:lastRenderedPageBreak/>
+        <w:drawing>
+          <wp:inline distT="0" distB="0" distL="0" distR="0" wp14:anchorId="2DC5C90E" wp14:editId="17BEF455">
+            <wp:extent cx="5611008" cy="1514686"/>
+            <wp:effectExtent l="0" t="0" r="8890" b="9525"/>
+            <wp:docPr id="250012315" name="Picture 1"/>
+            <wp:cNvGraphicFramePr>
+              <a:graphicFrameLocks xmlns:a="http://schemas.openxmlformats.org/drawingml/2006/main" noChangeAspect="1"/>
+            </wp:cNvGraphicFramePr>
+            <a:graphic xmlns:a="http://schemas.openxmlformats.org/drawingml/2006/main">
+              <a:graphicData uri="http://schemas.openxmlformats.org/drawingml/2006/picture">
+                <pic:pic xmlns:pic="http://schemas.openxmlformats.org/drawingml/2006/picture">
+                  <pic:nvPicPr>
+                    <pic:cNvPr id="250012315" name=""/>
+                    <pic:cNvPicPr/>
+                  </pic:nvPicPr>
+                  <pic:blipFill>
+                    <a:blip r:embed="rId15"/>
+                    <a:stretch>
+                      <a:fillRect/>
+                    </a:stretch>
+                  </pic:blipFill>
+                  <pic:spPr>
+                    <a:xfrm>
+                      <a:off x="0" y="0"/>
+                      <a:ext cx="5611008" cy="1514686"/>
+                    </a:xfrm>
+                    <a:prstGeom prst="rect">
+                      <a:avLst/>
+                    </a:prstGeom>
+                  </pic:spPr>
+                </pic:pic>
+              </a:graphicData>
+            </a:graphic>
+          </wp:inline>
+        </w:drawing>
+      </w:r>
+    </w:p>
+    <w:p>
+      <w:pPr>
+        <w:pBdr>
+          <w:bottom w:val="single" w:sz="6" w:space="1" w:color="auto"/>
+        </w:pBdr>
+      </w:pPr>
+    </w:p>
+    <w:p/>
+    <w:p>
+      <w:r>
+        <w:rPr>
+          <w:noProof/>
+        </w:rPr>
+        <w:drawing>
+          <wp:inline distT="0" distB="0" distL="0" distR="0" wp14:anchorId="13B016FB" wp14:editId="656E5434">
+            <wp:extent cx="4749800" cy="475787"/>
+            <wp:effectExtent l="0" t="0" r="0" b="635"/>
+            <wp:docPr id="1300983561" name="Picture 1"/>
+            <wp:cNvGraphicFramePr>
+              <a:graphicFrameLocks xmlns:a="http://schemas.openxmlformats.org/drawingml/2006/main" noChangeAspect="1"/>
+            </wp:cNvGraphicFramePr>
+            <a:graphic xmlns:a="http://schemas.openxmlformats.org/drawingml/2006/main">
+              <a:graphicData uri="http://schemas.openxmlformats.org/drawingml/2006/picture">
+                <pic:pic xmlns:pic="http://schemas.openxmlformats.org/drawingml/2006/picture">
+                  <pic:nvPicPr>
+                    <pic:cNvPr id="1300983561" name=""/>
+                    <pic:cNvPicPr/>
+                  </pic:nvPicPr>
+                  <pic:blipFill>
+                    <a:blip r:embed="rId16"/>
+                    <a:stretch>
+                      <a:fillRect/>
+                    </a:stretch>
+                  </pic:blipFill>
+                  <pic:spPr>
+                    <a:xfrm>
+                      <a:off x="0" y="0"/>
+                      <a:ext cx="4783994" cy="479212"/>
+                    </a:xfrm>
+                    <a:prstGeom prst="rect">
+                      <a:avLst/>
+                    </a:prstGeom>
+                  </pic:spPr>
+                </pic:pic>
+              </a:graphicData>
+            </a:graphic>
+          </wp:inline>
+        </w:drawing>
+      </w:r>
+    </w:p>
+    <w:p>
+      <w:r>
+        <w:t>He didn’t print the winner’s name.</w:t>
+      </w:r>
+    </w:p>
+    <w:p>
+      <w:r>
+        <w:t>My code:</w:t>
+      </w:r>
+    </w:p>
+    <w:p>
+      <w:r>
+        <w:rPr>
+          <w:noProof/>
+        </w:rPr>
+        <w:drawing>
+          <wp:inline distT="0" distB="0" distL="0" distR="0" wp14:anchorId="54A1317F" wp14:editId="46F4B079">
+            <wp:extent cx="4523640" cy="2444750"/>
+            <wp:effectExtent l="0" t="0" r="0" b="0"/>
+            <wp:docPr id="967621021" name="Picture 1"/>
+            <wp:cNvGraphicFramePr>
+              <a:graphicFrameLocks xmlns:a="http://schemas.openxmlformats.org/drawingml/2006/main" noChangeAspect="1"/>
+            </wp:cNvGraphicFramePr>
+            <a:graphic xmlns:a="http://schemas.openxmlformats.org/drawingml/2006/main">
+              <a:graphicData uri="http://schemas.openxmlformats.org/drawingml/2006/picture">
+                <pic:pic xmlns:pic="http://schemas.openxmlformats.org/drawingml/2006/picture">
+                  <pic:nvPicPr>
+                    <pic:cNvPr id="967621021" name=""/>
+                    <pic:cNvPicPr/>
+                  </pic:nvPicPr>
+                  <pic:blipFill>
+                    <a:blip r:embed="rId17"/>
+                    <a:stretch>
+                      <a:fillRect/>
+                    </a:stretch>
+                  </pic:blipFill>
+                  <pic:spPr>
+                    <a:xfrm>
+                      <a:off x="0" y="0"/>
+                      <a:ext cx="4528661" cy="2447463"/>
+                    </a:xfrm>
+                    <a:prstGeom prst="rect">
+                      <a:avLst/>
+                    </a:prstGeom>
+                  </pic:spPr>
+                </pic:pic>
+              </a:graphicData>
+            </a:graphic>
+          </wp:inline>
+        </w:drawing>
+      </w:r>
+    </w:p>
+    <w:p>
+      <w:r>
+        <w:t>I put all the typists into an array, and cycle through them. Then, for each one I check if they have finished the race. If they have, I print their name. Since this code only runs when the race is finished, and since there can only be one winner, this code will print exactly one winner when run.</w:t>
+      </w:r>
+    </w:p>
+    <w:p>
+      <w:pPr>
+        <w:pBdr>
+          <w:bottom w:val="single" w:sz="6" w:space="1" w:color="auto"/>
+        </w:pBdr>
+      </w:pPr>
+    </w:p>
+    <w:p/>
+    <w:p>
+      <w:r>
+        <w:rPr>
+          <w:noProof/>
+        </w:rPr>
+        <w:lastRenderedPageBreak/>
+        <w:drawing>
+          <wp:inline distT="0" distB="0" distL="0" distR="0" wp14:anchorId="3422FBE8" wp14:editId="3D26C6FA">
+            <wp:extent cx="5731510" cy="1315720"/>
+            <wp:effectExtent l="0" t="0" r="2540" b="0"/>
+            <wp:docPr id="1248765805" name="Picture 1"/>
+            <wp:cNvGraphicFramePr>
+              <a:graphicFrameLocks xmlns:a="http://schemas.openxmlformats.org/drawingml/2006/main" noChangeAspect="1"/>
+            </wp:cNvGraphicFramePr>
+            <a:graphic xmlns:a="http://schemas.openxmlformats.org/drawingml/2006/main">
+              <a:graphicData uri="http://schemas.openxmlformats.org/drawingml/2006/picture">
+                <pic:pic xmlns:pic="http://schemas.openxmlformats.org/drawingml/2006/picture">
+                  <pic:nvPicPr>
+                    <pic:cNvPr id="1248765805" name=""/>
+                    <pic:cNvPicPr/>
+                  </pic:nvPicPr>
+                  <pic:blipFill>
+                    <a:blip r:embed="rId18"/>
+                    <a:stretch>
+                      <a:fillRect/>
+                    </a:stretch>
+                  </pic:blipFill>
+                  <pic:spPr>
+                    <a:xfrm>
+                      <a:off x="0" y="0"/>
+                      <a:ext cx="5731510" cy="1315720"/>
+                    </a:xfrm>
+                    <a:prstGeom prst="rect">
+                      <a:avLst/>
+                    </a:prstGeom>
+                  </pic:spPr>
+                </pic:pic>
+              </a:graphicData>
+            </a:graphic>
+          </wp:inline>
+        </w:drawing>
+      </w:r>
+    </w:p>
+    <w:p>
+      <w:r>
+        <w:t>Math.random, theTypist.getAccuracy() and MISTYPE_BASE_CHANCE are all numbers between 0 and 1.</w:t>
+      </w:r>
+    </w:p>
+    <w:p>
+      <w:r>
+        <w:t>This is not the correct logic. If we say (theTypist.getAccuracy()*MISTYPE_BASE_CHANCE) = a, then we can say the operation is:</w:t>
+      </w:r>
+    </w:p>
+    <w:p>
+      <w:r>
+        <w:t>If (Math.random() &lt; a) then a mistype happens.</w:t>
+      </w:r>
+    </w:p>
+    <w:p>
+      <w:r>
+        <w:t>Abstracting the specific syntax, we can say a = accuracy * base_chance.</w:t>
+      </w:r>
+    </w:p>
+    <w:p>
+      <w:r>
+        <w:t>On the operation (Math.random() &lt; a), if take some examples we can see the relationship if a is higher or lower:</w:t>
+      </w:r>
+    </w:p>
+    <w:p>
+      <w:r>
+        <w:t>e.g. a = 0.288 and Math.random() = 0.5, then it’s (0.5&lt;0.288).</w:t>
+      </w:r>
+    </w:p>
+    <w:p>
+      <w:r>
+        <w:t>e.g. a=0.24 and Math.random() = 0.5, then it’s (0.5&lt;0.240).</w:t>
+      </w:r>
+    </w:p>
+    <w:p>
+      <w:r>
+        <w:t>When a is bigger, (Math.random() &lt; a) is more likely to be true. This is because there are more numbers between 0 and 0.288 than there are numbers between 0 and 0.240, therefore when a is bigger, (Math.random() &lt; a) is more likely to be true. When that is true, a mistype happens. Therefore we want that to be more likely to be true when the accuracy is lower.</w:t>
+      </w:r>
+    </w:p>
+    <w:p>
+      <w:r>
+        <w:t>However, if we look at how a is calculated, it is the opposite:</w:t>
+      </w:r>
+    </w:p>
+    <w:p>
+      <w:r>
+        <w:t>a = accuracy*base_chance.</w:t>
+      </w:r>
+    </w:p>
+    <w:p>
+      <w:r>
+        <w:t>If we take base_chance as 0.3 (since I have left it as that for now), and take these examples:</w:t>
+      </w:r>
+    </w:p>
+    <w:p>
+      <w:r>
+        <w:t>Accuracy = 0.96, then a = 0.96 * 0.3 = 0.288</w:t>
+      </w:r>
+    </w:p>
+    <w:p>
+      <w:r>
+        <w:t>Accuracy = 0.8, then a = 0.8 * 0.3 = 0.240</w:t>
+      </w:r>
+    </w:p>
+    <w:p>
+      <w:r>
+        <w:t>When the accuracy was higher, a was higher. When a is higher, the chance of a mistype happening is higher. Therefore, when accuracy is higher, with our current logic, the chance of a mistype is higher. But we want the opposite, if the accuracy is higher, then the chance of a mistype should be lower.</w:t>
+      </w:r>
+    </w:p>
+    <w:p>
+      <w:r>
+        <w:t>This can be changed if we change accuracy to (1-accuracy).</w:t>
+      </w:r>
+    </w:p>
+    <w:p>
+      <w:r>
+        <w:lastRenderedPageBreak/>
+        <w:t>Testing these out with example values:</w:t>
+      </w:r>
+    </w:p>
+    <w:p>
+      <w:r>
+        <w:t>Accuracy = 0.96 therefore (1-accuracy) = 0.04, so 0.04*0.3=0.012</w:t>
+      </w:r>
+    </w:p>
+    <w:p>
+      <w:r>
+        <w:t>Accuracy = 0.8 therefore (1-accuracy) = 0.2, so 0.2*0.3=0.060</w:t>
+      </w:r>
+    </w:p>
+    <w:p>
+      <w:r>
+        <w:t>Therefore, when accuracy is higher, a is lower, so mistype chance is lower.</w:t>
+      </w:r>
+    </w:p>
+    <w:p>
+      <w:r>
+        <w:t>But, the chance of a random number between 0 and 1 being lower than 0.06 is still pretty unlikely. Therefore we need to change the base chance.</w:t>
+      </w:r>
+    </w:p>
+    <w:p>
+      <w:r>
+        <w:t>Testing out when base chance = 0.8:</w:t>
+      </w:r>
+    </w:p>
+    <w:p>
+      <w:r>
+        <w:t>(1-0.96)*0.8 = 0.032</w:t>
+      </w:r>
+    </w:p>
+    <w:p>
+      <w:r>
+        <w:t>(1-0.8)*0.8 = 0.360</w:t>
+      </w:r>
+    </w:p>
+    <w:p>
+      <w:r>
+        <w:t>These are reasonable values in my opinion, therefore I will also chance the mistype base chance to 0.8.</w:t>
+      </w:r>
+    </w:p>
+    <w:p>
+      <w:r>
+        <w:t>My code:</w:t>
+      </w:r>
+    </w:p>
+    <w:p>
+      <w:r>
+        <w:rPr>
+          <w:noProof/>
+        </w:rPr>
+        <w:drawing>
+          <wp:inline distT="0" distB="0" distL="0" distR="0" wp14:anchorId="0147C745" wp14:editId="27EB1DE3">
+            <wp:extent cx="5731510" cy="1075690"/>
+            <wp:effectExtent l="0" t="0" r="2540" b="0"/>
+            <wp:docPr id="1410099663" name="Picture 1"/>
+            <wp:cNvGraphicFramePr>
+              <a:graphicFrameLocks xmlns:a="http://schemas.openxmlformats.org/drawingml/2006/main" noChangeAspect="1"/>
+            </wp:cNvGraphicFramePr>
+            <a:graphic xmlns:a="http://schemas.openxmlformats.org/drawingml/2006/main">
+              <a:graphicData uri="http://schemas.openxmlformats.org/drawingml/2006/picture">
+                <pic:pic xmlns:pic="http://schemas.openxmlformats.org/drawingml/2006/picture">
+                  <pic:nvPicPr>
+                    <pic:cNvPr id="1410099663" name=""/>
+                    <pic:cNvPicPr/>
+                  </pic:nvPicPr>
+                  <pic:blipFill>
+                    <a:blip r:embed="rId19"/>
+                    <a:stretch>
+                      <a:fillRect/>
+                    </a:stretch>
+                  </pic:blipFill>
+                  <pic:spPr>
+                    <a:xfrm>
+                      <a:off x="0" y="0"/>
+                      <a:ext cx="5731510" cy="1075690"/>
+                    </a:xfrm>
+                    <a:prstGeom prst="rect">
+                      <a:avLst/>
+                    </a:prstGeom>
+                  </pic:spPr>
+                </pic:pic>
+              </a:graphicData>
+            </a:graphic>
+          </wp:inline>
+        </w:drawing>
+      </w:r>
+      <w:r>
+        <w:t xml:space="preserve"> </w:t>
+      </w:r>
+    </w:p>
+    <w:p>
+      <w:r>
+        <w:t>(MISTYPE_BASE_CHANCE was previously 0.3)</w:t>
+      </w:r>
+    </w:p>
+    <w:p>
+      <w:r>
+        <w:rPr>
+          <w:noProof/>
+        </w:rPr>
+        <w:drawing>
+          <wp:inline distT="0" distB="0" distL="0" distR="0" wp14:anchorId="4E4AC494" wp14:editId="256441C0">
+            <wp:extent cx="5731510" cy="1064895"/>
+            <wp:effectExtent l="0" t="0" r="2540" b="1905"/>
+            <wp:docPr id="1195503604" name="Picture 1"/>
+            <wp:cNvGraphicFramePr>
+              <a:graphicFrameLocks xmlns:a="http://schemas.openxmlformats.org/drawingml/2006/main" noChangeAspect="1"/>
+            </wp:cNvGraphicFramePr>
+            <a:graphic xmlns:a="http://schemas.openxmlformats.org/drawingml/2006/main">
+              <a:graphicData uri="http://schemas.openxmlformats.org/drawingml/2006/picture">
+                <pic:pic xmlns:pic="http://schemas.openxmlformats.org/drawingml/2006/picture">
+                  <pic:nvPicPr>
+                    <pic:cNvPr id="1195503604" name=""/>
+                    <pic:cNvPicPr/>
+                  </pic:nvPicPr>
+                  <pic:blipFill>
+                    <a:blip r:embed="rId20"/>
+                    <a:stretch>
+                      <a:fillRect/>
+                    </a:stretch>
+                  </pic:blipFill>
+                  <pic:spPr>
+                    <a:xfrm>
+                      <a:off x="0" y="0"/>
+                      <a:ext cx="5731510" cy="1064895"/>
+                    </a:xfrm>
+                    <a:prstGeom prst="rect">
+                      <a:avLst/>
+                    </a:prstGeom>
+                  </pic:spPr>
+                </pic:pic>
+              </a:graphicData>
+            </a:graphic>
+          </wp:inline>
+        </w:drawing>
+      </w:r>
+    </w:p>
+    <w:p/>
+    <w:p/>
+    <w:p>
+      <w:pPr>
+        <w:pBdr>
+          <w:top w:val="single" w:sz="6" w:space="1" w:color="auto"/>
+          <w:bottom w:val="single" w:sz="6" w:space="1" w:color="auto"/>
+        </w:pBdr>
+      </w:pPr>
+    </w:p>
+    <w:p>
+      <w:pPr>
+        <w:pBdr>
+          <w:top w:val="single" w:sz="6" w:space="1" w:color="auto"/>
+          <w:bottom w:val="single" w:sz="6" w:space="1" w:color="auto"/>
+        </w:pBdr>
+      </w:pPr>
+      <w:r>
+        <w:rPr>
+          <w:noProof/>
+        </w:rPr>
+        <w:lastRenderedPageBreak/>
+        <w:drawing>
+          <wp:inline distT="0" distB="0" distL="0" distR="0" wp14:anchorId="41E00695" wp14:editId="3DBED536">
+            <wp:extent cx="5731510" cy="3269615"/>
+            <wp:effectExtent l="0" t="0" r="2540" b="6985"/>
+            <wp:docPr id="726929988" name="Picture 1"/>
+            <wp:cNvGraphicFramePr>
+              <a:graphicFrameLocks xmlns:a="http://schemas.openxmlformats.org/drawingml/2006/main" noChangeAspect="1"/>
+            </wp:cNvGraphicFramePr>
+            <a:graphic xmlns:a="http://schemas.openxmlformats.org/drawingml/2006/main">
+              <a:graphicData uri="http://schemas.openxmlformats.org/drawingml/2006/picture">
+                <pic:pic xmlns:pic="http://schemas.openxmlformats.org/drawingml/2006/picture">
+                  <pic:nvPicPr>
+                    <pic:cNvPr id="726929988" name=""/>
+                    <pic:cNvPicPr/>
+                  </pic:nvPicPr>
+                  <pic:blipFill>
+                    <a:blip r:embed="rId21"/>
+                    <a:stretch>
+                      <a:fillRect/>
+                    </a:stretch>
+                  </pic:blipFill>
+                  <pic:spPr>
+                    <a:xfrm>
+                      <a:off x="0" y="0"/>
+                      <a:ext cx="5731510" cy="3269615"/>
+                    </a:xfrm>
+                    <a:prstGeom prst="rect">
+                      <a:avLst/>
+                    </a:prstGeom>
+                  </pic:spPr>
+                </pic:pic>
+              </a:graphicData>
+            </a:graphic>
+          </wp:inline>
+        </w:drawing>
+      </w:r>
+    </w:p>
+    <w:p>
+      <w:pPr>
+        <w:pBdr>
+          <w:top w:val="single" w:sz="6" w:space="1" w:color="auto"/>
+          <w:bottom w:val="single" w:sz="6" w:space="1" w:color="auto"/>
+        </w:pBdr>
+      </w:pPr>
+      <w:r>
+        <w:t>The comment says that it returns true if the typist’s progress has reached or passed the passage length, but the condition only checks if they have reached the passage length, not passed.</w:t>
+      </w:r>
+    </w:p>
+    <w:p>
+      <w:pPr>
+        <w:pBdr>
+          <w:top w:val="single" w:sz="6" w:space="1" w:color="auto"/>
+          <w:bottom w:val="single" w:sz="6" w:space="1" w:color="auto"/>
+        </w:pBdr>
+      </w:pPr>
+      <w:r>
+        <w:t>Therefore, I have modified the code:</w:t>
+      </w:r>
+    </w:p>
+    <w:p>
+      <w:pPr>
+        <w:pBdr>
+          <w:top w:val="single" w:sz="6" w:space="1" w:color="auto"/>
+          <w:bottom w:val="single" w:sz="6" w:space="1" w:color="auto"/>
+        </w:pBdr>
+      </w:pPr>
+      <w:r>
+        <w:drawing>
+          <wp:inline distT="0" distB="0" distL="0" distR="0" wp14:anchorId="0C8C66AA" wp14:editId="3CAE7186">
+            <wp:extent cx="5731510" cy="2919730"/>
+            <wp:effectExtent l="0" t="0" r="2540" b="0"/>
+            <wp:docPr id="1606331186" name="Picture 1"/>
+            <wp:cNvGraphicFramePr>
+              <a:graphicFrameLocks xmlns:a="http://schemas.openxmlformats.org/drawingml/2006/main" noChangeAspect="1"/>
+            </wp:cNvGraphicFramePr>
+            <a:graphic xmlns:a="http://schemas.openxmlformats.org/drawingml/2006/main">
+              <a:graphicData uri="http://schemas.openxmlformats.org/drawingml/2006/picture">
+                <pic:pic xmlns:pic="http://schemas.openxmlformats.org/drawingml/2006/picture">
+                  <pic:nvPicPr>
+                    <pic:cNvPr id="1606331186" name=""/>
+                    <pic:cNvPicPr/>
+                  </pic:nvPicPr>
+                  <pic:blipFill>
+                    <a:blip r:embed="rId22"/>
+                    <a:stretch>
+                      <a:fillRect/>
+                    </a:stretch>
+                  </pic:blipFill>
+                  <pic:spPr>
+                    <a:xfrm>
+                      <a:off x="0" y="0"/>
+                      <a:ext cx="5731510" cy="2919730"/>
+                    </a:xfrm>
+                    <a:prstGeom prst="rect">
+                      <a:avLst/>
+                    </a:prstGeom>
+                  </pic:spPr>
+                </pic:pic>
+              </a:graphicData>
+            </a:graphic>
+          </wp:inline>
+        </w:drawing>
+      </w:r>
+    </w:p>
+    <w:p>
+      <w:pPr>
+        <w:pBdr>
+          <w:top w:val="single" w:sz="6" w:space="1" w:color="auto"/>
+          <w:bottom w:val="single" w:sz="6" w:space="1" w:color="auto"/>
+        </w:pBdr>
+      </w:pPr>
+    </w:p>
+    <w:p/>
+    <w:p>
+      <w:r>
+        <w:rPr>
+          <w:noProof/>
+        </w:rPr>
+        <w:lastRenderedPageBreak/>
+        <w:drawing>
+          <wp:inline distT="0" distB="0" distL="0" distR="0" wp14:anchorId="4BA2B70C" wp14:editId="2870B5D3">
+            <wp:extent cx="5731510" cy="5099050"/>
+            <wp:effectExtent l="0" t="0" r="2540" b="6350"/>
+            <wp:docPr id="425293605" name="Picture 1"/>
+            <wp:cNvGraphicFramePr>
+              <a:graphicFrameLocks xmlns:a="http://schemas.openxmlformats.org/drawingml/2006/main" noChangeAspect="1"/>
+            </wp:cNvGraphicFramePr>
+            <a:graphic xmlns:a="http://schemas.openxmlformats.org/drawingml/2006/main">
+              <a:graphicData uri="http://schemas.openxmlformats.org/drawingml/2006/picture">
+                <pic:pic xmlns:pic="http://schemas.openxmlformats.org/drawingml/2006/picture">
+                  <pic:nvPicPr>
+                    <pic:cNvPr id="425293605" name=""/>
+                    <pic:cNvPicPr/>
+                  </pic:nvPicPr>
+                  <pic:blipFill>
+                    <a:blip r:embed="rId23"/>
+                    <a:stretch>
+                      <a:fillRect/>
+                    </a:stretch>
+                  </pic:blipFill>
+                  <pic:spPr>
+                    <a:xfrm>
+                      <a:off x="0" y="0"/>
+                      <a:ext cx="5731510" cy="5099050"/>
+                    </a:xfrm>
+                    <a:prstGeom prst="rect">
+                      <a:avLst/>
+                    </a:prstGeom>
+                  </pic:spPr>
+                </pic:pic>
+              </a:graphicData>
+            </a:graphic>
+          </wp:inline>
+        </w:drawing>
+      </w:r>
+    </w:p>
+    <w:p>
+      <w:r>
+        <w:t>In the screenshot shown in the specification, the burnt out logo is a tilde.</w:t>
+      </w:r>
+    </w:p>
+    <w:p>
+      <w:r>
+        <w:t>Also, in the screenshot, the number of equals is 2 more than the passage length, not 3.</w:t>
+      </w:r>
+    </w:p>
+    <w:p>
+      <w:r>
+        <w:t>My code:</w:t>
+      </w:r>
+    </w:p>
+    <w:p>
+      <w:pPr>
+        <w:pBdr>
+          <w:bottom w:val="single" w:sz="6" w:space="1" w:color="auto"/>
+        </w:pBdr>
+      </w:pPr>
+      <w:r>
+        <w:rPr>
+          <w:noProof/>
+        </w:rPr>
+        <w:lastRenderedPageBreak/>
+        <w:drawing>
+          <wp:inline distT="0" distB="0" distL="0" distR="0" wp14:anchorId="40B578BA" wp14:editId="4AEEE307">
+            <wp:extent cx="5731510" cy="4221480"/>
+            <wp:effectExtent l="0" t="0" r="2540" b="7620"/>
+            <wp:docPr id="404094024" name="Picture 1"/>
+            <wp:cNvGraphicFramePr>
+              <a:graphicFrameLocks xmlns:a="http://schemas.openxmlformats.org/drawingml/2006/main" noChangeAspect="1"/>
+            </wp:cNvGraphicFramePr>
+            <a:graphic xmlns:a="http://schemas.openxmlformats.org/drawingml/2006/main">
+              <a:graphicData uri="http://schemas.openxmlformats.org/drawingml/2006/picture">
+                <pic:pic xmlns:pic="http://schemas.openxmlformats.org/drawingml/2006/picture">
+                  <pic:nvPicPr>
+                    <pic:cNvPr id="404094024" name=""/>
+                    <pic:cNvPicPr/>
+                  </pic:nvPicPr>
+                  <pic:blipFill>
+                    <a:blip r:embed="rId24"/>
+                    <a:stretch>
+                      <a:fillRect/>
+                    </a:stretch>
+                  </pic:blipFill>
+                  <pic:spPr>
+                    <a:xfrm>
+                      <a:off x="0" y="0"/>
+                      <a:ext cx="5731510" cy="4221480"/>
+                    </a:xfrm>
+                    <a:prstGeom prst="rect">
+                      <a:avLst/>
+                    </a:prstGeom>
+                  </pic:spPr>
+                </pic:pic>
+              </a:graphicData>
+            </a:graphic>
+          </wp:inline>
+        </w:drawing>
+      </w:r>
+    </w:p>
+    <w:p>
+      <w:pPr>
+        <w:pBdr>
+          <w:bottom w:val="single" w:sz="6" w:space="1" w:color="auto"/>
+        </w:pBdr>
+      </w:pPr>
+    </w:p>
+    <w:p/>
+    <w:p>
+      <w:r>
+        <w:rPr>
+          <w:noProof/>
+        </w:rPr>
+        <w:lastRenderedPageBreak/>
+        <w:drawing>
+          <wp:inline distT="0" distB="0" distL="0" distR="0" wp14:anchorId="24670571" wp14:editId="5CCE70CB">
+            <wp:extent cx="5731510" cy="5779135"/>
+            <wp:effectExtent l="0" t="0" r="2540" b="0"/>
+            <wp:docPr id="1496547004" name="Picture 1"/>
+            <wp:cNvGraphicFramePr>
+              <a:graphicFrameLocks xmlns:a="http://schemas.openxmlformats.org/drawingml/2006/main" noChangeAspect="1"/>
+            </wp:cNvGraphicFramePr>
+            <a:graphic xmlns:a="http://schemas.openxmlformats.org/drawingml/2006/main">
+              <a:graphicData uri="http://schemas.openxmlformats.org/drawingml/2006/picture">
+                <pic:pic xmlns:pic="http://schemas.openxmlformats.org/drawingml/2006/picture">
+                  <pic:nvPicPr>
+                    <pic:cNvPr id="1496547004" name=""/>
+                    <pic:cNvPicPr/>
+                  </pic:nvPicPr>
+                  <pic:blipFill>
+                    <a:blip r:embed="rId25"/>
+                    <a:stretch>
+                      <a:fillRect/>
+                    </a:stretch>
+                  </pic:blipFill>
+                  <pic:spPr>
+                    <a:xfrm>
+                      <a:off x="0" y="0"/>
+                      <a:ext cx="5731510" cy="5779135"/>
+                    </a:xfrm>
+                    <a:prstGeom prst="rect">
+                      <a:avLst/>
+                    </a:prstGeom>
+                  </pic:spPr>
+                </pic:pic>
+              </a:graphicData>
+            </a:graphic>
+          </wp:inline>
+        </w:drawing>
+      </w:r>
+    </w:p>
+    <w:p>
+      <w:r>
+        <w:t>Currently there is no way to check if the typist has just mistyped, so I need to add that.</w:t>
+      </w:r>
+    </w:p>
+    <w:p>
+      <w:r>
+        <w:t xml:space="preserve">I added a new attribute to the Typist class – </w:t>
+      </w:r>
+      <w:proofErr w:type="spellStart"/>
+      <w:r>
+        <w:t>justMistyped</w:t>
+      </w:r>
+      <w:proofErr w:type="spellEnd"/>
+      <w:r>
+        <w:t>:</w:t>
+      </w:r>
+    </w:p>
+    <w:p>
+      <w:r>
+        <w:drawing>
+          <wp:inline distT="0" distB="0" distL="0" distR="0" wp14:anchorId="31D14E2A" wp14:editId="45B07B3F">
+            <wp:extent cx="4763165" cy="1991003"/>
+            <wp:effectExtent l="0" t="0" r="0" b="9525"/>
+            <wp:docPr id="1400728834" name="Picture 1"/>
+            <wp:cNvGraphicFramePr>
+              <a:graphicFrameLocks xmlns:a="http://schemas.openxmlformats.org/drawingml/2006/main" noChangeAspect="1"/>
+            </wp:cNvGraphicFramePr>
+            <a:graphic xmlns:a="http://schemas.openxmlformats.org/drawingml/2006/main">
+              <a:graphicData uri="http://schemas.openxmlformats.org/drawingml/2006/picture">
+                <pic:pic xmlns:pic="http://schemas.openxmlformats.org/drawingml/2006/picture">
+                  <pic:nvPicPr>
+                    <pic:cNvPr id="1400728834" name=""/>
+                    <pic:cNvPicPr/>
+                  </pic:nvPicPr>
+                  <pic:blipFill>
+                    <a:blip r:embed="rId26"/>
+                    <a:stretch>
+                      <a:fillRect/>
+                    </a:stretch>
+                  </pic:blipFill>
+                  <pic:spPr>
+                    <a:xfrm>
+                      <a:off x="0" y="0"/>
+                      <a:ext cx="4763165" cy="1991003"/>
+                    </a:xfrm>
+                    <a:prstGeom prst="rect">
+                      <a:avLst/>
+                    </a:prstGeom>
+                  </pic:spPr>
+                </pic:pic>
+              </a:graphicData>
+            </a:graphic>
+          </wp:inline>
+        </w:drawing>
+      </w:r>
+    </w:p>
+    <w:p>
+      <w:r>
+        <w:t xml:space="preserve">I added a </w:t>
+      </w:r>
+      <w:proofErr w:type="spellStart"/>
+      <w:r>
+        <w:t>hasJustMistyped</w:t>
+      </w:r>
+      <w:proofErr w:type="spellEnd"/>
+      <w:r>
+        <w:t xml:space="preserve"> method:</w:t>
+      </w:r>
+    </w:p>
+    <w:p>
+      <w:r>
+        <w:lastRenderedPageBreak/>
+        <w:drawing>
+          <wp:inline distT="0" distB="0" distL="0" distR="0" wp14:anchorId="34CD4544" wp14:editId="1BB50971">
+            <wp:extent cx="5731510" cy="2032635"/>
+            <wp:effectExtent l="0" t="0" r="2540" b="5715"/>
+            <wp:docPr id="1865789462" name="Picture 1"/>
+            <wp:cNvGraphicFramePr>
+              <a:graphicFrameLocks xmlns:a="http://schemas.openxmlformats.org/drawingml/2006/main" noChangeAspect="1"/>
+            </wp:cNvGraphicFramePr>
+            <a:graphic xmlns:a="http://schemas.openxmlformats.org/drawingml/2006/main">
+              <a:graphicData uri="http://schemas.openxmlformats.org/drawingml/2006/picture">
+                <pic:pic xmlns:pic="http://schemas.openxmlformats.org/drawingml/2006/picture">
+                  <pic:nvPicPr>
+                    <pic:cNvPr id="1865789462" name=""/>
+                    <pic:cNvPicPr/>
+                  </pic:nvPicPr>
+                  <pic:blipFill>
+                    <a:blip r:embed="rId27"/>
+                    <a:stretch>
+                      <a:fillRect/>
+                    </a:stretch>
+                  </pic:blipFill>
+                  <pic:spPr>
+                    <a:xfrm>
+                      <a:off x="0" y="0"/>
+                      <a:ext cx="5731510" cy="2032635"/>
+                    </a:xfrm>
+                    <a:prstGeom prst="rect">
+                      <a:avLst/>
+                    </a:prstGeom>
+                  </pic:spPr>
+                </pic:pic>
+              </a:graphicData>
+            </a:graphic>
+          </wp:inline>
+        </w:drawing>
+      </w:r>
+    </w:p>
+    <w:p/>
+    <w:p>
+      <w:r>
+        <w:t>This returns the status of whether the typist has just mistyped.</w:t>
+      </w:r>
+    </w:p>
+    <w:p>
+      <w:r>
+        <w:t>However, I will need to also reset this value when the typists are reset:</w:t>
+      </w:r>
+    </w:p>
+    <w:p>
+      <w:r>
+        <w:drawing>
+          <wp:inline distT="0" distB="0" distL="0" distR="0" wp14:anchorId="49B90F96" wp14:editId="535828EA">
+            <wp:extent cx="5731510" cy="1872615"/>
+            <wp:effectExtent l="0" t="0" r="2540" b="0"/>
+            <wp:docPr id="312637679" name="Picture 1"/>
+            <wp:cNvGraphicFramePr>
+              <a:graphicFrameLocks xmlns:a="http://schemas.openxmlformats.org/drawingml/2006/main" noChangeAspect="1"/>
+            </wp:cNvGraphicFramePr>
+            <a:graphic xmlns:a="http://schemas.openxmlformats.org/drawingml/2006/main">
+              <a:graphicData uri="http://schemas.openxmlformats.org/drawingml/2006/picture">
+                <pic:pic xmlns:pic="http://schemas.openxmlformats.org/drawingml/2006/picture">
+                  <pic:nvPicPr>
+                    <pic:cNvPr id="312637679" name=""/>
+                    <pic:cNvPicPr/>
+                  </pic:nvPicPr>
+                  <pic:blipFill>
+                    <a:blip r:embed="rId28"/>
+                    <a:stretch>
+                      <a:fillRect/>
+                    </a:stretch>
+                  </pic:blipFill>
+                  <pic:spPr>
+                    <a:xfrm>
+                      <a:off x="0" y="0"/>
+                      <a:ext cx="5731510" cy="1872615"/>
+                    </a:xfrm>
+                    <a:prstGeom prst="rect">
+                      <a:avLst/>
+                    </a:prstGeom>
+                  </pic:spPr>
+                </pic:pic>
+              </a:graphicData>
+            </a:graphic>
+          </wp:inline>
+        </w:drawing>
+      </w:r>
+    </w:p>
+    <w:p>
+      <w:r>
+        <w:t xml:space="preserve">If the user mistypes (so if the </w:t>
+      </w:r>
+      <w:proofErr w:type="spellStart"/>
+      <w:r>
+        <w:t>slideBack</w:t>
+      </w:r>
+      <w:proofErr w:type="spellEnd"/>
+      <w:r>
+        <w:t xml:space="preserve"> method is called) then ‘</w:t>
+      </w:r>
+      <w:proofErr w:type="spellStart"/>
+      <w:r>
+        <w:t>justMistyped</w:t>
+      </w:r>
+      <w:proofErr w:type="spellEnd"/>
+      <w:r>
+        <w:t>’ should be set to true:</w:t>
+      </w:r>
+    </w:p>
+    <w:p>
+      <w:r>
+        <w:drawing>
+          <wp:inline distT="0" distB="0" distL="0" distR="0" wp14:anchorId="268A3583" wp14:editId="17E19660">
+            <wp:extent cx="5731510" cy="2792730"/>
+            <wp:effectExtent l="0" t="0" r="2540" b="7620"/>
+            <wp:docPr id="97532021" name="Picture 1"/>
+            <wp:cNvGraphicFramePr>
+              <a:graphicFrameLocks xmlns:a="http://schemas.openxmlformats.org/drawingml/2006/main" noChangeAspect="1"/>
+            </wp:cNvGraphicFramePr>
+            <a:graphic xmlns:a="http://schemas.openxmlformats.org/drawingml/2006/main">
+              <a:graphicData uri="http://schemas.openxmlformats.org/drawingml/2006/picture">
+                <pic:pic xmlns:pic="http://schemas.openxmlformats.org/drawingml/2006/picture">
+                  <pic:nvPicPr>
+                    <pic:cNvPr id="97532021" name=""/>
+                    <pic:cNvPicPr/>
+                  </pic:nvPicPr>
+                  <pic:blipFill>
+                    <a:blip r:embed="rId29"/>
+                    <a:stretch>
+                      <a:fillRect/>
+                    </a:stretch>
+                  </pic:blipFill>
+                  <pic:spPr>
+                    <a:xfrm>
+                      <a:off x="0" y="0"/>
+                      <a:ext cx="5731510" cy="2792730"/>
+                    </a:xfrm>
+                    <a:prstGeom prst="rect">
+                      <a:avLst/>
+                    </a:prstGeom>
+                  </pic:spPr>
+                </pic:pic>
+              </a:graphicData>
+            </a:graphic>
+          </wp:inline>
+        </w:drawing>
+      </w:r>
+    </w:p>
+    <w:p>
+      <w:r>
+        <w:lastRenderedPageBreak/>
+        <w:t xml:space="preserve">However, when they type normally again (when the </w:t>
+      </w:r>
+      <w:proofErr w:type="spellStart"/>
+      <w:r>
+        <w:t>advanceTypist</w:t>
+      </w:r>
+      <w:proofErr w:type="spellEnd"/>
+      <w:r>
+        <w:t xml:space="preserve"> method is called), then the value should be reset (set to false). Since </w:t>
+      </w:r>
+      <w:proofErr w:type="spellStart"/>
+      <w:r>
+        <w:t>advanceTypist</w:t>
+      </w:r>
+      <w:proofErr w:type="spellEnd"/>
+      <w:r>
+        <w:t xml:space="preserve"> is in the </w:t>
+      </w:r>
+      <w:proofErr w:type="spellStart"/>
+      <w:r>
+        <w:t>TypingRace</w:t>
+      </w:r>
+      <w:proofErr w:type="spellEnd"/>
+      <w:r>
+        <w:t xml:space="preserve"> class, it cannot access the </w:t>
+      </w:r>
+      <w:proofErr w:type="spellStart"/>
+      <w:r>
+        <w:t>justMistyped</w:t>
+      </w:r>
+      <w:proofErr w:type="spellEnd"/>
+      <w:r>
+        <w:t xml:space="preserve"> attribute directly, therefore I will need to create a method to reset the value to false.</w:t>
+      </w:r>
+    </w:p>
+    <w:p>
+      <w:r>
+        <w:drawing>
+          <wp:inline distT="0" distB="0" distL="0" distR="0" wp14:anchorId="41220D33" wp14:editId="6AED815D">
+            <wp:extent cx="5731510" cy="1339850"/>
+            <wp:effectExtent l="0" t="0" r="2540" b="0"/>
+            <wp:docPr id="1459034119" name="Picture 1"/>
+            <wp:cNvGraphicFramePr>
+              <a:graphicFrameLocks xmlns:a="http://schemas.openxmlformats.org/drawingml/2006/main" noChangeAspect="1"/>
+            </wp:cNvGraphicFramePr>
+            <a:graphic xmlns:a="http://schemas.openxmlformats.org/drawingml/2006/main">
+              <a:graphicData uri="http://schemas.openxmlformats.org/drawingml/2006/picture">
+                <pic:pic xmlns:pic="http://schemas.openxmlformats.org/drawingml/2006/picture">
+                  <pic:nvPicPr>
+                    <pic:cNvPr id="1459034119" name=""/>
+                    <pic:cNvPicPr/>
+                  </pic:nvPicPr>
+                  <pic:blipFill>
+                    <a:blip r:embed="rId30"/>
+                    <a:stretch>
+                      <a:fillRect/>
+                    </a:stretch>
+                  </pic:blipFill>
+                  <pic:spPr>
+                    <a:xfrm>
+                      <a:off x="0" y="0"/>
+                      <a:ext cx="5731510" cy="1339850"/>
+                    </a:xfrm>
+                    <a:prstGeom prst="rect">
+                      <a:avLst/>
+                    </a:prstGeom>
+                  </pic:spPr>
+                </pic:pic>
+              </a:graphicData>
+            </a:graphic>
+          </wp:inline>
+        </w:drawing>
+      </w:r>
+    </w:p>
+    <w:p>
+      <w:r>
+        <w:drawing>
+          <wp:inline distT="0" distB="0" distL="0" distR="0" wp14:anchorId="69CC28FD" wp14:editId="1F7AE94F">
+            <wp:extent cx="5731510" cy="3791585"/>
+            <wp:effectExtent l="0" t="0" r="2540" b="0"/>
+            <wp:docPr id="298822377" name="Picture 1"/>
+            <wp:cNvGraphicFramePr>
+              <a:graphicFrameLocks xmlns:a="http://schemas.openxmlformats.org/drawingml/2006/main" noChangeAspect="1"/>
+            </wp:cNvGraphicFramePr>
+            <a:graphic xmlns:a="http://schemas.openxmlformats.org/drawingml/2006/main">
+              <a:graphicData uri="http://schemas.openxmlformats.org/drawingml/2006/picture">
+                <pic:pic xmlns:pic="http://schemas.openxmlformats.org/drawingml/2006/picture">
+                  <pic:nvPicPr>
+                    <pic:cNvPr id="298822377" name=""/>
+                    <pic:cNvPicPr/>
+                  </pic:nvPicPr>
+                  <pic:blipFill>
+                    <a:blip r:embed="rId31"/>
+                    <a:stretch>
+                      <a:fillRect/>
+                    </a:stretch>
+                  </pic:blipFill>
+                  <pic:spPr>
+                    <a:xfrm>
+                      <a:off x="0" y="0"/>
+                      <a:ext cx="5731510" cy="3791585"/>
+                    </a:xfrm>
+                    <a:prstGeom prst="rect">
+                      <a:avLst/>
+                    </a:prstGeom>
+                  </pic:spPr>
+                </pic:pic>
+              </a:graphicData>
+            </a:graphic>
+          </wp:inline>
+        </w:drawing>
+      </w:r>
+    </w:p>
+    <w:p>
+      <w:r>
+        <w:t>Now that I have made it clear if the typist has just mistyped, I need to set the symbol that they just mistyped, if they mistype.</w:t>
+      </w:r>
+    </w:p>
+    <w:p>
+      <w:r>
+        <w:lastRenderedPageBreak/>
+        <w:drawing>
+          <wp:inline distT="0" distB="0" distL="0" distR="0" wp14:anchorId="3F76F6D5" wp14:editId="4A849427">
+            <wp:extent cx="5731510" cy="4335780"/>
+            <wp:effectExtent l="0" t="0" r="2540" b="7620"/>
+            <wp:docPr id="1169780964" name="Picture 1"/>
+            <wp:cNvGraphicFramePr>
+              <a:graphicFrameLocks xmlns:a="http://schemas.openxmlformats.org/drawingml/2006/main" noChangeAspect="1"/>
+            </wp:cNvGraphicFramePr>
+            <a:graphic xmlns:a="http://schemas.openxmlformats.org/drawingml/2006/main">
+              <a:graphicData uri="http://schemas.openxmlformats.org/drawingml/2006/picture">
+                <pic:pic xmlns:pic="http://schemas.openxmlformats.org/drawingml/2006/picture">
+                  <pic:nvPicPr>
+                    <pic:cNvPr id="1169780964" name=""/>
+                    <pic:cNvPicPr/>
+                  </pic:nvPicPr>
+                  <pic:blipFill>
+                    <a:blip r:embed="rId32"/>
+                    <a:stretch>
+                      <a:fillRect/>
+                    </a:stretch>
+                  </pic:blipFill>
+                  <pic:spPr>
+                    <a:xfrm>
+                      <a:off x="0" y="0"/>
+                      <a:ext cx="5731510" cy="4335780"/>
+                    </a:xfrm>
+                    <a:prstGeom prst="rect">
+                      <a:avLst/>
+                    </a:prstGeom>
+                  </pic:spPr>
+                </pic:pic>
+              </a:graphicData>
+            </a:graphic>
+          </wp:inline>
+        </w:drawing>
+      </w:r>
+    </w:p>
+    <w:p>
+      <w:pPr>
+        <w:pBdr>
+          <w:bottom w:val="single" w:sz="6" w:space="1" w:color="auto"/>
+        </w:pBdr>
+      </w:pPr>
+      <w:r>
+        <w:drawing>
+          <wp:inline distT="0" distB="0" distL="0" distR="0" wp14:anchorId="25CA9901" wp14:editId="5921868D">
+            <wp:extent cx="5731510" cy="3519170"/>
+            <wp:effectExtent l="0" t="0" r="2540" b="5080"/>
+            <wp:docPr id="2131971674" name="Picture 1"/>
+            <wp:cNvGraphicFramePr>
+              <a:graphicFrameLocks xmlns:a="http://schemas.openxmlformats.org/drawingml/2006/main" noChangeAspect="1"/>
+            </wp:cNvGraphicFramePr>
+            <a:graphic xmlns:a="http://schemas.openxmlformats.org/drawingml/2006/main">
+              <a:graphicData uri="http://schemas.openxmlformats.org/drawingml/2006/picture">
+                <pic:pic xmlns:pic="http://schemas.openxmlformats.org/drawingml/2006/picture">
+                  <pic:nvPicPr>
+                    <pic:cNvPr id="2131971674" name=""/>
+                    <pic:cNvPicPr/>
+                  </pic:nvPicPr>
+                  <pic:blipFill>
+                    <a:blip r:embed="rId33"/>
+                    <a:stretch>
+                      <a:fillRect/>
+                    </a:stretch>
+                  </pic:blipFill>
+                  <pic:spPr>
+                    <a:xfrm>
+                      <a:off x="0" y="0"/>
+                      <a:ext cx="5731510" cy="3519170"/>
+                    </a:xfrm>
+                    <a:prstGeom prst="rect">
+                      <a:avLst/>
+                    </a:prstGeom>
+                  </pic:spPr>
+                </pic:pic>
+              </a:graphicData>
+            </a:graphic>
+          </wp:inline>
+        </w:drawing>
+      </w:r>
+    </w:p>
+    <w:p>
+      <w:pPr>
+        <w:pBdr>
+          <w:bottom w:val="single" w:sz="6" w:space="1" w:color="auto"/>
+        </w:pBdr>
+      </w:pPr>
+    </w:p>
+    <w:p/>
+    <w:p/>
+    <w:p/>
     <w:sectPr>
-      <w:headerReference w:type="default" r:id="rId12"/>
+      <w:headerReference w:type="default" r:id="rId34"/>
       <w:pgSz w:w="11906" w:h="16838"/>
       <w:pgMar w:top="1440" w:right="1440" w:bottom="1440" w:left="1440" w:header="708" w:footer="708" w:gutter="0"/>
       <w:cols w:space="708"/>
@@ -1510,7 +3245,6 @@
   <w:style w:type="character" w:default="1" w:styleId="DefaultParagraphFont">
     <w:name w:val="Default Paragraph Font"/>
     <w:uiPriority w:val="1"/>
-    <w:semiHidden/>
     <w:unhideWhenUsed/>
   </w:style>
   <w:style w:type="table" w:default="1" w:styleId="TableNormal">

</xml_diff>

<commit_message>
Added performance adjustment - if a typist burns out, their accuracy decreases by 0.02, but when they win a race, their accuracy increases by 0.02. Accuracy was printing to a very high number of decimal places, so I made a change where when it prints the accuracy, it rounds to 2 decimal places. It does not round for calculations.
</commit_message>
<xml_diff>
--- a/Part1/OOP Typing Race Simulator Part 1 Report.docx
+++ b/Part1/OOP Typing Race Simulator Part 1 Report.docx
@@ -2128,24 +2128,22 @@
     </w:p>
     <w:p>
       <w:r>
+        <w:t>Firstly, the comment says that the symbol + ~ together take 2 characters but the code subtracts only 1 from spacesAfter. So I modified the comment.</w:t>
+      </w:r>
+    </w:p>
+    <w:p>
+      <w:r>
         <w:t>Currently there is no way to check if the typist has just mistyped, so I need to add that.</w:t>
       </w:r>
     </w:p>
     <w:p>
       <w:r>
-        <w:t xml:space="preserve">I added a new attribute to the Typist class – </w:t>
-      </w:r>
-      <w:proofErr w:type="spellStart"/>
-      <w:r>
-        <w:t>justMistyped</w:t>
-      </w:r>
-      <w:proofErr w:type="spellEnd"/>
-      <w:r>
-        <w:t>:</w:t>
-      </w:r>
-    </w:p>
-    <w:p>
-      <w:r>
+        <w:t>I added a new attribute to the Typist class – justMistyped:</w:t>
+      </w:r>
+    </w:p>
+    <w:p>
+      <w:r>
+        <w:lastRenderedPageBreak/>
         <w:drawing>
           <wp:inline distT="0" distB="0" distL="0" distR="0" wp14:anchorId="31D14E2A" wp14:editId="45B07B3F">
             <wp:extent cx="4763165" cy="1991003"/>
@@ -2185,20 +2183,11 @@
     </w:p>
     <w:p>
       <w:r>
-        <w:t xml:space="preserve">I added a </w:t>
-      </w:r>
-      <w:proofErr w:type="spellStart"/>
-      <w:r>
-        <w:t>hasJustMistyped</w:t>
-      </w:r>
-      <w:proofErr w:type="spellEnd"/>
-      <w:r>
-        <w:t xml:space="preserve"> method:</w:t>
-      </w:r>
-    </w:p>
-    <w:p>
-      <w:r>
-        <w:lastRenderedPageBreak/>
+        <w:t>I added a hasJustMistyped method:</w:t>
+      </w:r>
+    </w:p>
+    <w:p>
+      <w:r>
         <w:drawing>
           <wp:inline distT="0" distB="0" distL="0" distR="0" wp14:anchorId="34CD4544" wp14:editId="1BB50971">
             <wp:extent cx="5731510" cy="2032635"/>
@@ -2288,27 +2277,12 @@
     </w:p>
     <w:p>
       <w:r>
-        <w:t xml:space="preserve">If the user mistypes (so if the </w:t>
-      </w:r>
-      <w:proofErr w:type="spellStart"/>
-      <w:r>
-        <w:t>slideBack</w:t>
-      </w:r>
-      <w:proofErr w:type="spellEnd"/>
-      <w:r>
-        <w:t xml:space="preserve"> method is called) then ‘</w:t>
-      </w:r>
-      <w:proofErr w:type="spellStart"/>
-      <w:r>
-        <w:t>justMistyped</w:t>
-      </w:r>
-      <w:proofErr w:type="spellEnd"/>
-      <w:r>
-        <w:t>’ should be set to true:</w:t>
-      </w:r>
-    </w:p>
-    <w:p>
-      <w:r>
+        <w:t>If the user mistypes (so if the slideBack method is called) then ‘justMistyped’ should be set to true:</w:t>
+      </w:r>
+    </w:p>
+    <w:p>
+      <w:r>
+        <w:lastRenderedPageBreak/>
         <w:drawing>
           <wp:inline distT="0" distB="0" distL="0" distR="0" wp14:anchorId="268A3583" wp14:editId="17E19660">
             <wp:extent cx="5731510" cy="2792730"/>
@@ -2348,40 +2322,7 @@
     </w:p>
     <w:p>
       <w:r>
-        <w:lastRenderedPageBreak/>
-        <w:t xml:space="preserve">However, when they type normally again (when the </w:t>
-      </w:r>
-      <w:proofErr w:type="spellStart"/>
-      <w:r>
-        <w:t>advanceTypist</w:t>
-      </w:r>
-      <w:proofErr w:type="spellEnd"/>
-      <w:r>
-        <w:t xml:space="preserve"> method is called), then the value should be reset (set to false). Since </w:t>
-      </w:r>
-      <w:proofErr w:type="spellStart"/>
-      <w:r>
-        <w:t>advanceTypist</w:t>
-      </w:r>
-      <w:proofErr w:type="spellEnd"/>
-      <w:r>
-        <w:t xml:space="preserve"> is in the </w:t>
-      </w:r>
-      <w:proofErr w:type="spellStart"/>
-      <w:r>
-        <w:t>TypingRace</w:t>
-      </w:r>
-      <w:proofErr w:type="spellEnd"/>
-      <w:r>
-        <w:t xml:space="preserve"> class, it cannot access the </w:t>
-      </w:r>
-      <w:proofErr w:type="spellStart"/>
-      <w:r>
-        <w:t>justMistyped</w:t>
-      </w:r>
-      <w:proofErr w:type="spellEnd"/>
-      <w:r>
-        <w:t xml:space="preserve"> attribute directly, therefore I will need to create a method to reset the value to false.</w:t>
+        <w:t>However, when they type normally again (when the advanceTypist method is called), then the value should be reset (set to false). Since advanceTypist is in the TypingRace class, it cannot access the justMistyped attribute directly, therefore I will need to create a method to reset the value to false.</w:t>
       </w:r>
     </w:p>
     <w:p>
@@ -2425,6 +2366,7 @@
     </w:p>
     <w:p>
       <w:r>
+        <w:lastRenderedPageBreak/>
         <w:drawing>
           <wp:inline distT="0" distB="0" distL="0" distR="0" wp14:anchorId="69CC28FD" wp14:editId="1F7AE94F">
             <wp:extent cx="5731510" cy="3791585"/>
@@ -2471,10 +2413,10 @@
       <w:r>
         <w:lastRenderedPageBreak/>
         <w:drawing>
-          <wp:inline distT="0" distB="0" distL="0" distR="0" wp14:anchorId="3F76F6D5" wp14:editId="4A849427">
-            <wp:extent cx="5731510" cy="4335780"/>
-            <wp:effectExtent l="0" t="0" r="2540" b="7620"/>
-            <wp:docPr id="1169780964" name="Picture 1"/>
+          <wp:inline distT="0" distB="0" distL="0" distR="0" wp14:anchorId="7A569013" wp14:editId="199EF643">
+            <wp:extent cx="5731510" cy="4514850"/>
+            <wp:effectExtent l="0" t="0" r="2540" b="0"/>
+            <wp:docPr id="514881818" name="Picture 1"/>
             <wp:cNvGraphicFramePr>
               <a:graphicFrameLocks xmlns:a="http://schemas.openxmlformats.org/drawingml/2006/main" noChangeAspect="1"/>
             </wp:cNvGraphicFramePr>
@@ -2482,7 +2424,7 @@
               <a:graphicData uri="http://schemas.openxmlformats.org/drawingml/2006/picture">
                 <pic:pic xmlns:pic="http://schemas.openxmlformats.org/drawingml/2006/picture">
                   <pic:nvPicPr>
-                    <pic:cNvPr id="1169780964" name=""/>
+                    <pic:cNvPr id="514881818" name=""/>
                     <pic:cNvPicPr/>
                   </pic:nvPicPr>
                   <pic:blipFill>
@@ -2494,7 +2436,7 @@
                   <pic:spPr>
                     <a:xfrm>
                       <a:off x="0" y="0"/>
-                      <a:ext cx="5731510" cy="4335780"/>
+                      <a:ext cx="5731510" cy="4514850"/>
                     </a:xfrm>
                     <a:prstGeom prst="rect">
                       <a:avLst/>
@@ -2558,11 +2500,209 @@
         </w:pBdr>
       </w:pPr>
     </w:p>
+    <w:p>
+      <w:pPr>
+        <w:pBdr>
+          <w:bottom w:val="single" w:sz="6" w:space="1" w:color="auto"/>
+        </w:pBdr>
+      </w:pPr>
+    </w:p>
+    <w:p>
+      <w:pPr>
+        <w:pBdr>
+          <w:bottom w:val="single" w:sz="6" w:space="1" w:color="auto"/>
+        </w:pBdr>
+      </w:pPr>
+    </w:p>
     <w:p/>
-    <w:p/>
-    <w:p/>
+    <w:p>
+      <w:r>
+        <w:t>I implemented the performance adjustment – where a typist burning out slightly decreases their accuracy, and a typist winning a race slightly increases their accuracy. However, the program represents the accuracy to a very high number of decimal places:</w:t>
+      </w:r>
+    </w:p>
+    <w:p>
+      <w:r>
+        <w:drawing>
+          <wp:inline distT="0" distB="0" distL="0" distR="0" wp14:anchorId="54611AAE" wp14:editId="26E3DB43">
+            <wp:extent cx="5731510" cy="916305"/>
+            <wp:effectExtent l="0" t="0" r="2540" b="0"/>
+            <wp:docPr id="251921710" name="Picture 1"/>
+            <wp:cNvGraphicFramePr>
+              <a:graphicFrameLocks xmlns:a="http://schemas.openxmlformats.org/drawingml/2006/main" noChangeAspect="1"/>
+            </wp:cNvGraphicFramePr>
+            <a:graphic xmlns:a="http://schemas.openxmlformats.org/drawingml/2006/main">
+              <a:graphicData uri="http://schemas.openxmlformats.org/drawingml/2006/picture">
+                <pic:pic xmlns:pic="http://schemas.openxmlformats.org/drawingml/2006/picture">
+                  <pic:nvPicPr>
+                    <pic:cNvPr id="251921710" name=""/>
+                    <pic:cNvPicPr/>
+                  </pic:nvPicPr>
+                  <pic:blipFill>
+                    <a:blip r:embed="rId34"/>
+                    <a:stretch>
+                      <a:fillRect/>
+                    </a:stretch>
+                  </pic:blipFill>
+                  <pic:spPr>
+                    <a:xfrm>
+                      <a:off x="0" y="0"/>
+                      <a:ext cx="5731510" cy="916305"/>
+                    </a:xfrm>
+                    <a:prstGeom prst="rect">
+                      <a:avLst/>
+                    </a:prstGeom>
+                  </pic:spPr>
+                </pic:pic>
+              </a:graphicData>
+            </a:graphic>
+          </wp:inline>
+        </w:drawing>
+      </w:r>
+    </w:p>
+    <w:p>
+      <w:r>
+        <w:t>So I have decided to use the DecimalFormat subclass to format the accuracy to 2 decimal places.</w:t>
+      </w:r>
+    </w:p>
+    <w:p>
+      <w:r>
+        <w:t>I imported the subclass at the top of TypingRace.java:</w:t>
+      </w:r>
+    </w:p>
+    <w:p>
+      <w:r>
+        <w:drawing>
+          <wp:inline distT="0" distB="0" distL="0" distR="0" wp14:anchorId="63C0DF3F" wp14:editId="794161BA">
+            <wp:extent cx="4115374" cy="381053"/>
+            <wp:effectExtent l="0" t="0" r="0" b="0"/>
+            <wp:docPr id="1966309454" name="Picture 1"/>
+            <wp:cNvGraphicFramePr>
+              <a:graphicFrameLocks xmlns:a="http://schemas.openxmlformats.org/drawingml/2006/main" noChangeAspect="1"/>
+            </wp:cNvGraphicFramePr>
+            <a:graphic xmlns:a="http://schemas.openxmlformats.org/drawingml/2006/main">
+              <a:graphicData uri="http://schemas.openxmlformats.org/drawingml/2006/picture">
+                <pic:pic xmlns:pic="http://schemas.openxmlformats.org/drawingml/2006/picture">
+                  <pic:nvPicPr>
+                    <pic:cNvPr id="1966309454" name=""/>
+                    <pic:cNvPicPr/>
+                  </pic:nvPicPr>
+                  <pic:blipFill>
+                    <a:blip r:embed="rId35"/>
+                    <a:stretch>
+                      <a:fillRect/>
+                    </a:stretch>
+                  </pic:blipFill>
+                  <pic:spPr>
+                    <a:xfrm>
+                      <a:off x="0" y="0"/>
+                      <a:ext cx="4115374" cy="381053"/>
+                    </a:xfrm>
+                    <a:prstGeom prst="rect">
+                      <a:avLst/>
+                    </a:prstGeom>
+                  </pic:spPr>
+                </pic:pic>
+              </a:graphicData>
+            </a:graphic>
+          </wp:inline>
+        </w:drawing>
+      </w:r>
+    </w:p>
+    <w:p>
+      <w:r>
+        <w:t>And I created a new object of it at the beginning of the class so that it can be used throughout without having to define it everytime:</w:t>
+      </w:r>
+    </w:p>
+    <w:p>
+      <w:r>
+        <w:drawing>
+          <wp:inline distT="0" distB="0" distL="0" distR="0" wp14:anchorId="2EBEBDDB" wp14:editId="6B5BD24A">
+            <wp:extent cx="5731510" cy="2440940"/>
+            <wp:effectExtent l="0" t="0" r="2540" b="0"/>
+            <wp:docPr id="262735295" name="Picture 1"/>
+            <wp:cNvGraphicFramePr>
+              <a:graphicFrameLocks xmlns:a="http://schemas.openxmlformats.org/drawingml/2006/main" noChangeAspect="1"/>
+            </wp:cNvGraphicFramePr>
+            <a:graphic xmlns:a="http://schemas.openxmlformats.org/drawingml/2006/main">
+              <a:graphicData uri="http://schemas.openxmlformats.org/drawingml/2006/picture">
+                <pic:pic xmlns:pic="http://schemas.openxmlformats.org/drawingml/2006/picture">
+                  <pic:nvPicPr>
+                    <pic:cNvPr id="262735295" name=""/>
+                    <pic:cNvPicPr/>
+                  </pic:nvPicPr>
+                  <pic:blipFill>
+                    <a:blip r:embed="rId36"/>
+                    <a:stretch>
+                      <a:fillRect/>
+                    </a:stretch>
+                  </pic:blipFill>
+                  <pic:spPr>
+                    <a:xfrm>
+                      <a:off x="0" y="0"/>
+                      <a:ext cx="5731510" cy="2440940"/>
+                    </a:xfrm>
+                    <a:prstGeom prst="rect">
+                      <a:avLst/>
+                    </a:prstGeom>
+                  </pic:spPr>
+                </pic:pic>
+              </a:graphicData>
+            </a:graphic>
+          </wp:inline>
+        </w:drawing>
+      </w:r>
+    </w:p>
+    <w:p>
+      <w:r>
+        <w:t>I then use it when printing the accuracy:</w:t>
+      </w:r>
+    </w:p>
+    <w:p>
+      <w:r>
+        <w:drawing>
+          <wp:inline distT="0" distB="0" distL="0" distR="0" wp14:anchorId="484417E1" wp14:editId="0A7D61A5">
+            <wp:extent cx="5731510" cy="1259840"/>
+            <wp:effectExtent l="0" t="0" r="2540" b="0"/>
+            <wp:docPr id="556580691" name="Picture 1"/>
+            <wp:cNvGraphicFramePr>
+              <a:graphicFrameLocks xmlns:a="http://schemas.openxmlformats.org/drawingml/2006/main" noChangeAspect="1"/>
+            </wp:cNvGraphicFramePr>
+            <a:graphic xmlns:a="http://schemas.openxmlformats.org/drawingml/2006/main">
+              <a:graphicData uri="http://schemas.openxmlformats.org/drawingml/2006/picture">
+                <pic:pic xmlns:pic="http://schemas.openxmlformats.org/drawingml/2006/picture">
+                  <pic:nvPicPr>
+                    <pic:cNvPr id="556580691" name=""/>
+                    <pic:cNvPicPr/>
+                  </pic:nvPicPr>
+                  <pic:blipFill>
+                    <a:blip r:embed="rId37"/>
+                    <a:stretch>
+                      <a:fillRect/>
+                    </a:stretch>
+                  </pic:blipFill>
+                  <pic:spPr>
+                    <a:xfrm>
+                      <a:off x="0" y="0"/>
+                      <a:ext cx="5731510" cy="1259840"/>
+                    </a:xfrm>
+                    <a:prstGeom prst="rect">
+                      <a:avLst/>
+                    </a:prstGeom>
+                  </pic:spPr>
+                </pic:pic>
+              </a:graphicData>
+            </a:graphic>
+          </wp:inline>
+        </w:drawing>
+      </w:r>
+    </w:p>
+    <w:p>
+      <w:r>
+        <w:t>But I do not round for calculations as this could lead to inaccurate calculations.</w:t>
+      </w:r>
+    </w:p>
     <w:sectPr>
-      <w:headerReference w:type="default" r:id="rId34"/>
+      <w:headerReference w:type="default" r:id="rId38"/>
       <w:pgSz w:w="11906" w:h="16838"/>
       <w:pgMar w:top="1440" w:right="1440" w:bottom="1440" w:left="1440" w:header="708" w:footer="708" w:gutter="0"/>
       <w:cols w:space="708"/>

</xml_diff>

<commit_message>
Made it so that typist cannot type and mistype on the same move, by adding an 'else if'.
</commit_message>
<xml_diff>
--- a/Part1/OOP Typing Race Simulator Part 1 Report.docx
+++ b/Part1/OOP Typing Race Simulator Part 1 Report.docx
@@ -76,6 +76,7 @@
       <w:r>
         <w:tab/>
       </w:r>
+      <w:proofErr w:type="spellStart"/>
       <w:r>
         <w:rPr>
           <w:sz w:val="22"/>
@@ -83,6 +84,7 @@
         </w:rPr>
         <w:t>getAccuracy</w:t>
       </w:r>
+      <w:proofErr w:type="spellEnd"/>
     </w:p>
     <w:p>
       <w:pPr>
@@ -97,8 +99,16 @@
           <w:szCs w:val="22"/>
         </w:rPr>
         <w:tab/>
+      </w:r>
+      <w:proofErr w:type="spellStart"/>
+      <w:r>
+        <w:rPr>
+          <w:sz w:val="22"/>
+          <w:szCs w:val="22"/>
+        </w:rPr>
         <w:t>getProgress</w:t>
       </w:r>
+      <w:proofErr w:type="spellEnd"/>
     </w:p>
     <w:p>
       <w:pPr>
@@ -113,8 +123,16 @@
           <w:szCs w:val="22"/>
         </w:rPr>
         <w:tab/>
+      </w:r>
+      <w:proofErr w:type="spellStart"/>
+      <w:r>
+        <w:rPr>
+          <w:sz w:val="22"/>
+          <w:szCs w:val="22"/>
+        </w:rPr>
         <w:t>getName</w:t>
       </w:r>
+      <w:proofErr w:type="spellEnd"/>
     </w:p>
     <w:p>
       <w:pPr>
@@ -129,8 +147,16 @@
           <w:szCs w:val="22"/>
         </w:rPr>
         <w:tab/>
+      </w:r>
+      <w:proofErr w:type="spellStart"/>
+      <w:r>
+        <w:rPr>
+          <w:sz w:val="22"/>
+          <w:szCs w:val="22"/>
+        </w:rPr>
         <w:t>getSymbol</w:t>
       </w:r>
+      <w:proofErr w:type="spellEnd"/>
     </w:p>
     <w:p>
       <w:pPr>
@@ -145,8 +171,16 @@
           <w:szCs w:val="22"/>
         </w:rPr>
         <w:tab/>
+      </w:r>
+      <w:proofErr w:type="spellStart"/>
+      <w:r>
+        <w:rPr>
+          <w:sz w:val="22"/>
+          <w:szCs w:val="22"/>
+        </w:rPr>
         <w:t>getBurnoutTurnsRemaining</w:t>
       </w:r>
+      <w:proofErr w:type="spellEnd"/>
     </w:p>
     <w:p>
       <w:pPr>
@@ -161,8 +195,16 @@
           <w:szCs w:val="22"/>
         </w:rPr>
         <w:tab/>
+      </w:r>
+      <w:proofErr w:type="spellStart"/>
+      <w:r>
+        <w:rPr>
+          <w:sz w:val="22"/>
+          <w:szCs w:val="22"/>
+        </w:rPr>
         <w:t>isBurntOut</w:t>
       </w:r>
+      <w:proofErr w:type="spellEnd"/>
     </w:p>
     <w:p>
       <w:pPr>
@@ -190,8 +232,16 @@
           <w:szCs w:val="22"/>
         </w:rPr>
         <w:tab/>
+      </w:r>
+      <w:proofErr w:type="spellStart"/>
+      <w:r>
+        <w:rPr>
+          <w:sz w:val="22"/>
+          <w:szCs w:val="22"/>
+        </w:rPr>
         <w:t>burnOut</w:t>
       </w:r>
+      <w:proofErr w:type="spellEnd"/>
     </w:p>
     <w:p>
       <w:pPr>
@@ -206,8 +256,16 @@
           <w:szCs w:val="22"/>
         </w:rPr>
         <w:tab/>
+      </w:r>
+      <w:proofErr w:type="spellStart"/>
+      <w:r>
+        <w:rPr>
+          <w:sz w:val="22"/>
+          <w:szCs w:val="22"/>
+        </w:rPr>
         <w:t>recoverFromBurnOut</w:t>
       </w:r>
+      <w:proofErr w:type="spellEnd"/>
     </w:p>
     <w:p>
       <w:pPr>
@@ -222,8 +280,16 @@
           <w:szCs w:val="22"/>
         </w:rPr>
         <w:tab/>
+      </w:r>
+      <w:proofErr w:type="spellStart"/>
+      <w:r>
+        <w:rPr>
+          <w:sz w:val="22"/>
+          <w:szCs w:val="22"/>
+        </w:rPr>
         <w:t>resetToStart</w:t>
       </w:r>
+      <w:proofErr w:type="spellEnd"/>
     </w:p>
     <w:p>
       <w:pPr>
@@ -238,8 +304,16 @@
           <w:szCs w:val="22"/>
         </w:rPr>
         <w:tab/>
+      </w:r>
+      <w:proofErr w:type="spellStart"/>
+      <w:r>
+        <w:rPr>
+          <w:sz w:val="22"/>
+          <w:szCs w:val="22"/>
+        </w:rPr>
         <w:t>typeCharacter</w:t>
       </w:r>
+      <w:proofErr w:type="spellEnd"/>
     </w:p>
     <w:p>
       <w:pPr>
@@ -254,8 +328,16 @@
           <w:szCs w:val="22"/>
         </w:rPr>
         <w:tab/>
+      </w:r>
+      <w:proofErr w:type="spellStart"/>
+      <w:r>
+        <w:rPr>
+          <w:sz w:val="22"/>
+          <w:szCs w:val="22"/>
+        </w:rPr>
         <w:t>slideBack</w:t>
       </w:r>
+      <w:proofErr w:type="spellEnd"/>
     </w:p>
     <w:p>
       <w:pPr>
@@ -270,8 +352,16 @@
           <w:szCs w:val="22"/>
         </w:rPr>
         <w:tab/>
+      </w:r>
+      <w:proofErr w:type="spellStart"/>
+      <w:r>
+        <w:rPr>
+          <w:sz w:val="22"/>
+          <w:szCs w:val="22"/>
+        </w:rPr>
         <w:t>setAccuracy</w:t>
       </w:r>
+      <w:proofErr w:type="spellEnd"/>
     </w:p>
     <w:p>
       <w:pPr>
@@ -286,8 +376,16 @@
           <w:szCs w:val="22"/>
         </w:rPr>
         <w:tab/>
+      </w:r>
+      <w:proofErr w:type="spellStart"/>
+      <w:r>
+        <w:rPr>
+          <w:sz w:val="22"/>
+          <w:szCs w:val="22"/>
+        </w:rPr>
         <w:t>setSymbol</w:t>
       </w:r>
+      <w:proofErr w:type="spellEnd"/>
     </w:p>
     <w:p>
       <w:pPr>
@@ -305,8 +403,13 @@
       </w:r>
     </w:p>
     <w:p>
-      <w:r>
-        <w:t>slideBack validation logic:</w:t>
+      <w:proofErr w:type="spellStart"/>
+      <w:r>
+        <w:t>slideBack</w:t>
+      </w:r>
+      <w:proofErr w:type="spellEnd"/>
+      <w:r>
+        <w:t xml:space="preserve"> validation logic:</w:t>
       </w:r>
     </w:p>
     <w:p>
@@ -349,8 +452,13 @@
       </w:r>
     </w:p>
     <w:p>
-      <w:r>
-        <w:t>setAccuracy validation logic:</w:t>
+      <w:proofErr w:type="spellStart"/>
+      <w:r>
+        <w:t>setAccuracy</w:t>
+      </w:r>
+      <w:proofErr w:type="spellEnd"/>
+      <w:r>
+        <w:t xml:space="preserve"> validation logic:</w:t>
       </w:r>
     </w:p>
     <w:p>
@@ -485,6 +593,8 @@
       <w:r>
         <w:t xml:space="preserve">After running the </w:t>
       </w:r>
+      <w:proofErr w:type="spellStart"/>
+      <w:proofErr w:type="gramStart"/>
       <w:r>
         <w:rPr>
           <w:rFonts w:ascii="Consolas" w:eastAsia="Times New Roman" w:hAnsi="Consolas" w:cs="Times New Roman"/>
@@ -497,6 +607,7 @@
         </w:rPr>
         <w:t>typeCharacter</w:t>
       </w:r>
+      <w:proofErr w:type="spellEnd"/>
       <w:r>
         <w:rPr>
           <w:rFonts w:ascii="Consolas" w:eastAsia="Times New Roman" w:hAnsi="Consolas" w:cs="Times New Roman"/>
@@ -507,7 +618,20 @@
           <w:lang w:eastAsia="en-GB"/>
           <w14:ligatures w14:val="none"/>
         </w:rPr>
-        <w:t>()</w:t>
+        <w:t>(</w:t>
+      </w:r>
+      <w:proofErr w:type="gramEnd"/>
+      <w:r>
+        <w:rPr>
+          <w:rFonts w:ascii="Consolas" w:eastAsia="Times New Roman" w:hAnsi="Consolas" w:cs="Times New Roman"/>
+          <w:color w:val="3B3B3B"/>
+          <w:kern w:val="0"/>
+          <w:sz w:val="21"/>
+          <w:szCs w:val="21"/>
+          <w:lang w:eastAsia="en-GB"/>
+          <w14:ligatures w14:val="none"/>
+        </w:rPr>
+        <w:t>)</w:t>
       </w:r>
       <w:r>
         <w:t xml:space="preserve"> command three times, the progress went up to 3 (from 0).</w:t>
@@ -564,6 +688,8 @@
       <w:r>
         <w:t xml:space="preserve">Calling </w:t>
       </w:r>
+      <w:proofErr w:type="spellStart"/>
+      <w:proofErr w:type="gramStart"/>
       <w:r>
         <w:rPr>
           <w:rFonts w:ascii="Consolas" w:eastAsia="Times New Roman" w:hAnsi="Consolas" w:cs="Times New Roman"/>
@@ -576,6 +702,7 @@
         </w:rPr>
         <w:t>slideBack</w:t>
       </w:r>
+      <w:proofErr w:type="spellEnd"/>
       <w:r>
         <w:rPr>
           <w:rFonts w:ascii="Consolas" w:eastAsia="Times New Roman" w:hAnsi="Consolas" w:cs="Times New Roman"/>
@@ -588,6 +715,7 @@
         </w:rPr>
         <w:t>(</w:t>
       </w:r>
+      <w:proofErr w:type="gramEnd"/>
       <w:r>
         <w:rPr>
           <w:rFonts w:ascii="Consolas" w:eastAsia="Times New Roman" w:hAnsi="Consolas" w:cs="Times New Roman"/>
@@ -675,6 +803,8 @@
       <w:r>
         <w:t xml:space="preserve">Calling </w:t>
       </w:r>
+      <w:proofErr w:type="spellStart"/>
+      <w:proofErr w:type="gramStart"/>
       <w:r>
         <w:rPr>
           <w:rFonts w:ascii="Consolas" w:eastAsia="Times New Roman" w:hAnsi="Consolas" w:cs="Times New Roman"/>
@@ -687,6 +817,7 @@
         </w:rPr>
         <w:t>burnOut</w:t>
       </w:r>
+      <w:proofErr w:type="spellEnd"/>
       <w:r>
         <w:rPr>
           <w:rFonts w:ascii="Consolas" w:eastAsia="Times New Roman" w:hAnsi="Consolas" w:cs="Times New Roman"/>
@@ -699,6 +830,7 @@
         </w:rPr>
         <w:t>(</w:t>
       </w:r>
+      <w:proofErr w:type="gramEnd"/>
       <w:r>
         <w:rPr>
           <w:rFonts w:ascii="Consolas" w:eastAsia="Times New Roman" w:hAnsi="Consolas" w:cs="Times New Roman"/>
@@ -729,6 +861,8 @@
       <w:r>
         <w:t xml:space="preserve"> </w:t>
       </w:r>
+      <w:proofErr w:type="spellStart"/>
+      <w:proofErr w:type="gramStart"/>
       <w:r>
         <w:rPr>
           <w:rFonts w:ascii="Consolas" w:eastAsia="Times New Roman" w:hAnsi="Consolas" w:cs="Times New Roman"/>
@@ -741,6 +875,7 @@
         </w:rPr>
         <w:t>recoverFromBurnout</w:t>
       </w:r>
+      <w:proofErr w:type="spellEnd"/>
       <w:r>
         <w:rPr>
           <w:rFonts w:ascii="Consolas" w:eastAsia="Times New Roman" w:hAnsi="Consolas" w:cs="Times New Roman"/>
@@ -751,7 +886,20 @@
           <w:lang w:eastAsia="en-GB"/>
           <w14:ligatures w14:val="none"/>
         </w:rPr>
-        <w:t>()</w:t>
+        <w:t>(</w:t>
+      </w:r>
+      <w:proofErr w:type="gramEnd"/>
+      <w:r>
+        <w:rPr>
+          <w:rFonts w:ascii="Consolas" w:eastAsia="Times New Roman" w:hAnsi="Consolas" w:cs="Times New Roman"/>
+          <w:color w:val="3B3B3B"/>
+          <w:kern w:val="0"/>
+          <w:sz w:val="21"/>
+          <w:szCs w:val="21"/>
+          <w:lang w:eastAsia="en-GB"/>
+          <w14:ligatures w14:val="none"/>
+        </w:rPr>
+        <w:t>)</w:t>
       </w:r>
       <w:r>
         <w:t>:</w:t>
@@ -816,8 +964,18 @@
         </w:rPr>
       </w:pPr>
       <w:r>
-        <w:t xml:space="preserve">Continuing from the last test where the number of burnout turns remaining is 1, I ran this command </w:t>
-      </w:r>
+        <w:t xml:space="preserve">Continuing from the last test where the number of </w:t>
+      </w:r>
+      <w:proofErr w:type="gramStart"/>
+      <w:r>
+        <w:t>burnout</w:t>
+      </w:r>
+      <w:proofErr w:type="gramEnd"/>
+      <w:r>
+        <w:t xml:space="preserve"> turns remaining is 1, I ran this command </w:t>
+      </w:r>
+      <w:proofErr w:type="spellStart"/>
+      <w:proofErr w:type="gramStart"/>
       <w:r>
         <w:rPr>
           <w:rFonts w:ascii="Consolas" w:eastAsia="Times New Roman" w:hAnsi="Consolas" w:cs="Times New Roman"/>
@@ -830,6 +988,7 @@
         </w:rPr>
         <w:t>recoverFromBurnout</w:t>
       </w:r>
+      <w:proofErr w:type="spellEnd"/>
       <w:r>
         <w:rPr>
           <w:rFonts w:ascii="Consolas" w:eastAsia="Times New Roman" w:hAnsi="Consolas" w:cs="Times New Roman"/>
@@ -840,7 +999,20 @@
           <w:lang w:eastAsia="en-GB"/>
           <w14:ligatures w14:val="none"/>
         </w:rPr>
-        <w:t>()</w:t>
+        <w:t>(</w:t>
+      </w:r>
+      <w:proofErr w:type="gramEnd"/>
+      <w:r>
+        <w:rPr>
+          <w:rFonts w:ascii="Consolas" w:eastAsia="Times New Roman" w:hAnsi="Consolas" w:cs="Times New Roman"/>
+          <w:color w:val="3B3B3B"/>
+          <w:kern w:val="0"/>
+          <w:sz w:val="21"/>
+          <w:szCs w:val="21"/>
+          <w:lang w:eastAsia="en-GB"/>
+          <w14:ligatures w14:val="none"/>
+        </w:rPr>
+        <w:t>)</w:t>
       </w:r>
       <w:r>
         <w:t xml:space="preserve"> to reset the number of burnout terms to 0. </w:t>
@@ -906,6 +1078,8 @@
       <w:r>
         <w:t xml:space="preserve">I ran </w:t>
       </w:r>
+      <w:proofErr w:type="spellStart"/>
+      <w:proofErr w:type="gramStart"/>
       <w:r>
         <w:rPr>
           <w:rFonts w:ascii="Consolas" w:eastAsia="Times New Roman" w:hAnsi="Consolas" w:cs="Times New Roman"/>
@@ -918,6 +1092,7 @@
         </w:rPr>
         <w:t>typeCharacter</w:t>
       </w:r>
+      <w:proofErr w:type="spellEnd"/>
       <w:r>
         <w:rPr>
           <w:rFonts w:ascii="Consolas" w:eastAsia="Times New Roman" w:hAnsi="Consolas" w:cs="Times New Roman"/>
@@ -928,11 +1103,26 @@
           <w:lang w:eastAsia="en-GB"/>
           <w14:ligatures w14:val="none"/>
         </w:rPr>
-        <w:t>()</w:t>
+        <w:t>(</w:t>
+      </w:r>
+      <w:proofErr w:type="gramEnd"/>
+      <w:r>
+        <w:rPr>
+          <w:rFonts w:ascii="Consolas" w:eastAsia="Times New Roman" w:hAnsi="Consolas" w:cs="Times New Roman"/>
+          <w:color w:val="202020"/>
+          <w:kern w:val="0"/>
+          <w:sz w:val="21"/>
+          <w:szCs w:val="21"/>
+          <w:lang w:eastAsia="en-GB"/>
+          <w14:ligatures w14:val="none"/>
+        </w:rPr>
+        <w:t>)</w:t>
       </w:r>
       <w:r>
         <w:t xml:space="preserve"> once as well as </w:t>
       </w:r>
+      <w:proofErr w:type="spellStart"/>
+      <w:proofErr w:type="gramStart"/>
       <w:r>
         <w:rPr>
           <w:rFonts w:ascii="Consolas" w:eastAsia="Times New Roman" w:hAnsi="Consolas" w:cs="Times New Roman"/>
@@ -945,6 +1135,7 @@
         </w:rPr>
         <w:t>burnOut</w:t>
       </w:r>
+      <w:proofErr w:type="spellEnd"/>
       <w:r>
         <w:rPr>
           <w:rFonts w:ascii="Consolas" w:eastAsia="Times New Roman" w:hAnsi="Consolas" w:cs="Times New Roman"/>
@@ -957,6 +1148,7 @@
         </w:rPr>
         <w:t>(</w:t>
       </w:r>
+      <w:proofErr w:type="gramEnd"/>
       <w:r>
         <w:rPr>
           <w:rFonts w:ascii="Consolas" w:eastAsia="Times New Roman" w:hAnsi="Consolas" w:cs="Times New Roman"/>
@@ -982,7 +1174,15 @@
         <w:t>)</w:t>
       </w:r>
       <w:r>
-        <w:t xml:space="preserve"> to make the progress and burnout turns not zero before reset (to check that the reset actually works):</w:t>
+        <w:t xml:space="preserve"> to make the progress and burnout turns not zero before reset (to check that the reset </w:t>
+      </w:r>
+      <w:proofErr w:type="gramStart"/>
+      <w:r>
+        <w:t>actually works</w:t>
+      </w:r>
+      <w:proofErr w:type="gramEnd"/>
+      <w:r>
+        <w:t>):</w:t>
       </w:r>
     </w:p>
     <w:p>
@@ -1046,6 +1246,8 @@
       <w:r>
         <w:t xml:space="preserve">I ran </w:t>
       </w:r>
+      <w:proofErr w:type="spellStart"/>
+      <w:proofErr w:type="gramStart"/>
       <w:r>
         <w:rPr>
           <w:rFonts w:ascii="Consolas" w:eastAsia="Times New Roman" w:hAnsi="Consolas" w:cs="Times New Roman"/>
@@ -1058,6 +1260,7 @@
         </w:rPr>
         <w:t>setAccuracy</w:t>
       </w:r>
+      <w:proofErr w:type="spellEnd"/>
       <w:r>
         <w:rPr>
           <w:rFonts w:ascii="Consolas" w:eastAsia="Times New Roman" w:hAnsi="Consolas" w:cs="Times New Roman"/>
@@ -1070,6 +1273,7 @@
         </w:rPr>
         <w:t>(</w:t>
       </w:r>
+      <w:proofErr w:type="gramEnd"/>
       <w:r>
         <w:rPr>
           <w:rFonts w:ascii="Consolas" w:eastAsia="Times New Roman" w:hAnsi="Consolas" w:cs="Times New Roman"/>
@@ -1109,6 +1313,8 @@
       <w:r>
         <w:t xml:space="preserve"> before testing the first case, since -0.3 is below 0.0, and then ran </w:t>
       </w:r>
+      <w:proofErr w:type="spellStart"/>
+      <w:proofErr w:type="gramStart"/>
       <w:r>
         <w:rPr>
           <w:rFonts w:ascii="Consolas" w:eastAsia="Times New Roman" w:hAnsi="Consolas" w:cs="Times New Roman"/>
@@ -1121,6 +1327,7 @@
         </w:rPr>
         <w:t>setAccuracy</w:t>
       </w:r>
+      <w:proofErr w:type="spellEnd"/>
       <w:r>
         <w:rPr>
           <w:rFonts w:ascii="Consolas" w:eastAsia="Times New Roman" w:hAnsi="Consolas" w:cs="Times New Roman"/>
@@ -1133,6 +1340,7 @@
         </w:rPr>
         <w:t>(</w:t>
       </w:r>
+      <w:proofErr w:type="gramEnd"/>
       <w:r>
         <w:rPr>
           <w:rFonts w:ascii="Consolas" w:eastAsia="Times New Roman" w:hAnsi="Consolas" w:cs="Times New Roman"/>
@@ -1286,7 +1494,15 @@
         <w:t>The mistype base chance seems to be okay</w:t>
       </w:r>
       <w:r>
-        <w:t>. In the screenshot from the specification, it seemed like “QWERTY_QUEEN” slided back 2 spaces after mistyping so I will keep the slide back amount to 2</w:t>
+        <w:t xml:space="preserve">. In the screenshot from the specification, it seemed like “QWERTY_QUEEN” </w:t>
+      </w:r>
+      <w:proofErr w:type="spellStart"/>
+      <w:r>
+        <w:t>slided</w:t>
+      </w:r>
+      <w:proofErr w:type="spellEnd"/>
+      <w:r>
+        <w:t xml:space="preserve"> back 2 spaces after mistyping so I will keep the slide back amount to 2</w:t>
       </w:r>
       <w:r>
         <w:t>. Furthermore, I decreased the burnout duration to 2 since</w:t>
@@ -1617,43 +1833,133 @@
       </w:r>
     </w:p>
     <w:p>
-      <w:r>
-        <w:t>Math.random, theTypist.getAccuracy() and MISTYPE_BASE_CHANCE are all numbers between 0 and 1.</w:t>
-      </w:r>
-    </w:p>
-    <w:p>
-      <w:r>
-        <w:t>This is not the correct logic. If we say (theTypist.getAccuracy()*MISTYPE_BASE_CHANCE) = a, then we can say the operation is:</w:t>
-      </w:r>
-    </w:p>
-    <w:p>
-      <w:r>
-        <w:t>If (Math.random() &lt; a) then a mistype happens.</w:t>
-      </w:r>
-    </w:p>
-    <w:p>
-      <w:r>
-        <w:t>Abstracting the specific syntax, we can say a = accuracy * base_chance.</w:t>
-      </w:r>
-    </w:p>
-    <w:p>
-      <w:r>
-        <w:t>On the operation (Math.random() &lt; a), if take some examples we can see the relationship if a is higher or lower:</w:t>
-      </w:r>
-    </w:p>
-    <w:p>
-      <w:r>
-        <w:t>e.g. a = 0.288 and Math.random() = 0.5, then it’s (0.5&lt;0.288).</w:t>
-      </w:r>
-    </w:p>
-    <w:p>
-      <w:r>
-        <w:t>e.g. a=0.24 and Math.random() = 0.5, then it’s (0.5&lt;0.240).</w:t>
-      </w:r>
-    </w:p>
-    <w:p>
-      <w:r>
-        <w:t>When a is bigger, (Math.random() &lt; a) is more likely to be true. This is because there are more numbers between 0 and 0.288 than there are numbers between 0 and 0.240, therefore when a is bigger, (Math.random() &lt; a) is more likely to be true. When that is true, a mistype happens. Therefore we want that to be more likely to be true when the accuracy is lower.</w:t>
+      <w:proofErr w:type="spellStart"/>
+      <w:r>
+        <w:t>Math.random</w:t>
+      </w:r>
+      <w:proofErr w:type="spellEnd"/>
+      <w:r>
+        <w:t xml:space="preserve">, </w:t>
+      </w:r>
+      <w:proofErr w:type="spellStart"/>
+      <w:r>
+        <w:t>theTypist.getAccuracy</w:t>
+      </w:r>
+      <w:proofErr w:type="spellEnd"/>
+      <w:r>
+        <w:t>() and MISTYPE_BASE_CHANCE are all numbers between 0 and 1.</w:t>
+      </w:r>
+    </w:p>
+    <w:p>
+      <w:r>
+        <w:t>This is not the correct logic. If we say (</w:t>
+      </w:r>
+      <w:proofErr w:type="spellStart"/>
+      <w:r>
+        <w:t>theTypist.getAccuracy</w:t>
+      </w:r>
+      <w:proofErr w:type="spellEnd"/>
+      <w:proofErr w:type="gramStart"/>
+      <w:r>
+        <w:t>()*</w:t>
+      </w:r>
+      <w:proofErr w:type="gramEnd"/>
+      <w:r>
+        <w:t>MISTYPE_BASE_CHANCE) = a, then we can say the operation is:</w:t>
+      </w:r>
+    </w:p>
+    <w:p>
+      <w:r>
+        <w:t>If (</w:t>
+      </w:r>
+      <w:proofErr w:type="spellStart"/>
+      <w:r>
+        <w:t>Math.random</w:t>
+      </w:r>
+      <w:proofErr w:type="spellEnd"/>
+      <w:r>
+        <w:t>() &lt; a) then a mistype happens.</w:t>
+      </w:r>
+    </w:p>
+    <w:p>
+      <w:r>
+        <w:t xml:space="preserve">Abstracting the specific syntax, we can say a = accuracy * </w:t>
+      </w:r>
+      <w:proofErr w:type="spellStart"/>
+      <w:r>
+        <w:t>base_chance</w:t>
+      </w:r>
+      <w:proofErr w:type="spellEnd"/>
+      <w:r>
+        <w:t>.</w:t>
+      </w:r>
+    </w:p>
+    <w:p>
+      <w:r>
+        <w:t>On the operation (</w:t>
+      </w:r>
+      <w:proofErr w:type="spellStart"/>
+      <w:r>
+        <w:t>Math.random</w:t>
+      </w:r>
+      <w:proofErr w:type="spellEnd"/>
+      <w:r>
+        <w:t>() &lt; a), if take some examples we can see the relationship if a is higher or lower:</w:t>
+      </w:r>
+    </w:p>
+    <w:p>
+      <w:r>
+        <w:t xml:space="preserve">e.g. a = 0.288 and </w:t>
+      </w:r>
+      <w:proofErr w:type="spellStart"/>
+      <w:r>
+        <w:t>Math.random</w:t>
+      </w:r>
+      <w:proofErr w:type="spellEnd"/>
+      <w:r>
+        <w:t>() = 0.5, then it’s (0.5&lt;0.288).</w:t>
+      </w:r>
+    </w:p>
+    <w:p>
+      <w:r>
+        <w:t xml:space="preserve">e.g. a=0.24 and </w:t>
+      </w:r>
+      <w:proofErr w:type="spellStart"/>
+      <w:r>
+        <w:t>Math.random</w:t>
+      </w:r>
+      <w:proofErr w:type="spellEnd"/>
+      <w:r>
+        <w:t>() = 0.5, then it’s (0.5&lt;0.240).</w:t>
+      </w:r>
+    </w:p>
+    <w:p>
+      <w:r>
+        <w:t>When a is bigger, (</w:t>
+      </w:r>
+      <w:proofErr w:type="spellStart"/>
+      <w:r>
+        <w:t>Math.random</w:t>
+      </w:r>
+      <w:proofErr w:type="spellEnd"/>
+      <w:r>
+        <w:t>() &lt; a) is more likely to be true. This is because there are more numbers between 0 and 0.288 than there are numbers between 0 and 0.240, therefore when a is bigger, (</w:t>
+      </w:r>
+      <w:proofErr w:type="spellStart"/>
+      <w:r>
+        <w:t>Math.random</w:t>
+      </w:r>
+      <w:proofErr w:type="spellEnd"/>
+      <w:r>
+        <w:t xml:space="preserve">() &lt; a) is more likely to be true. When that is true, a mistype happens. </w:t>
+      </w:r>
+      <w:proofErr w:type="gramStart"/>
+      <w:r>
+        <w:t>Therefore</w:t>
+      </w:r>
+      <w:proofErr w:type="gramEnd"/>
+      <w:r>
+        <w:t xml:space="preserve"> we want that to be more likely to be true when the accuracy is lower.</w:t>
       </w:r>
     </w:p>
     <w:p>
@@ -1663,12 +1969,28 @@
     </w:p>
     <w:p>
       <w:r>
-        <w:t>a = accuracy*base_chance.</w:t>
-      </w:r>
-    </w:p>
-    <w:p>
-      <w:r>
-        <w:t>If we take base_chance as 0.3 (since I have left it as that for now), and take these examples:</w:t>
+        <w:t>a = accuracy*</w:t>
+      </w:r>
+      <w:proofErr w:type="spellStart"/>
+      <w:r>
+        <w:t>base_chance</w:t>
+      </w:r>
+      <w:proofErr w:type="spellEnd"/>
+      <w:r>
+        <w:t>.</w:t>
+      </w:r>
+    </w:p>
+    <w:p>
+      <w:r>
+        <w:t xml:space="preserve">If we take </w:t>
+      </w:r>
+      <w:proofErr w:type="spellStart"/>
+      <w:r>
+        <w:t>base_chance</w:t>
+      </w:r>
+      <w:proofErr w:type="spellEnd"/>
+      <w:r>
+        <w:t xml:space="preserve"> as 0.3 (since I have left it as that for now), and take these examples:</w:t>
       </w:r>
     </w:p>
     <w:p>
@@ -1713,8 +2035,29 @@
       </w:r>
     </w:p>
     <w:p>
-      <w:r>
-        <w:t>But, the chance of a random number between 0 and 1 being lower than 0.06 is still pretty unlikely. Therefore we need to change the base chance.</w:t>
+      <w:proofErr w:type="gramStart"/>
+      <w:r>
+        <w:t>But,</w:t>
+      </w:r>
+      <w:proofErr w:type="gramEnd"/>
+      <w:r>
+        <w:t xml:space="preserve"> the chance of a random number between 0 and 1 being lower than 0.06 is still </w:t>
+      </w:r>
+      <w:proofErr w:type="gramStart"/>
+      <w:r>
+        <w:t>pretty unlikely</w:t>
+      </w:r>
+      <w:proofErr w:type="gramEnd"/>
+      <w:r>
+        <w:t xml:space="preserve">. </w:t>
+      </w:r>
+      <w:proofErr w:type="gramStart"/>
+      <w:r>
+        <w:t>Therefore</w:t>
+      </w:r>
+      <w:proofErr w:type="gramEnd"/>
+      <w:r>
+        <w:t xml:space="preserve"> we need to change the base chance.</w:t>
       </w:r>
     </w:p>
     <w:p>
@@ -1724,17 +2067,41 @@
     </w:p>
     <w:p>
       <w:r>
-        <w:t>(1-0.96)*0.8 = 0.032</w:t>
-      </w:r>
-    </w:p>
-    <w:p>
-      <w:r>
-        <w:t>(1-0.8)*0.8 = 0.360</w:t>
-      </w:r>
-    </w:p>
-    <w:p>
-      <w:r>
-        <w:t>These are reasonable values in my opinion, therefore I will also chance the mistype base chance to 0.8.</w:t>
+        <w:t>(1-0.</w:t>
+      </w:r>
+      <w:proofErr w:type="gramStart"/>
+      <w:r>
+        <w:t>96)*</w:t>
+      </w:r>
+      <w:proofErr w:type="gramEnd"/>
+      <w:r>
+        <w:t>0.8 = 0.032</w:t>
+      </w:r>
+    </w:p>
+    <w:p>
+      <w:r>
+        <w:t>(1-0.</w:t>
+      </w:r>
+      <w:proofErr w:type="gramStart"/>
+      <w:r>
+        <w:t>8)*</w:t>
+      </w:r>
+      <w:proofErr w:type="gramEnd"/>
+      <w:r>
+        <w:t>0.8 = 0.360</w:t>
+      </w:r>
+    </w:p>
+    <w:p>
+      <w:r>
+        <w:t xml:space="preserve">These are reasonable values in my </w:t>
+      </w:r>
+      <w:proofErr w:type="gramStart"/>
+      <w:r>
+        <w:t>opinion,</w:t>
+      </w:r>
+      <w:proofErr w:type="gramEnd"/>
+      <w:r>
+        <w:t xml:space="preserve"> therefore I will also chance the mistype base chance to 0.8.</w:t>
       </w:r>
     </w:p>
     <w:p>
@@ -1923,6 +2290,9 @@
         </w:pBdr>
       </w:pPr>
       <w:r>
+        <w:rPr>
+          <w:noProof/>
+        </w:rPr>
         <w:drawing>
           <wp:inline distT="0" distB="0" distL="0" distR="0" wp14:anchorId="0C8C66AA" wp14:editId="3CAE7186">
             <wp:extent cx="5731510" cy="2919730"/>
@@ -2014,7 +2384,15 @@
     </w:p>
     <w:p>
       <w:r>
-        <w:t>In the screenshot shown in the specification, the burnt out logo is a tilde.</w:t>
+        <w:t xml:space="preserve">In the screenshot shown in the specification, the </w:t>
+      </w:r>
+      <w:proofErr w:type="gramStart"/>
+      <w:r>
+        <w:t>burnt out</w:t>
+      </w:r>
+      <w:proofErr w:type="gramEnd"/>
+      <w:r>
+        <w:t xml:space="preserve"> logo is a tilde.</w:t>
       </w:r>
     </w:p>
     <w:p>
@@ -2128,7 +2506,23 @@
     </w:p>
     <w:p>
       <w:r>
-        <w:t>Firstly, the comment says that the symbol + ~ together take 2 characters but the code subtracts only 1 from spacesAfter. So I modified the comment.</w:t>
+        <w:t xml:space="preserve">Firstly, the comment says that the symbol + ~ together take 2 characters but the code subtracts only 1 from </w:t>
+      </w:r>
+      <w:proofErr w:type="spellStart"/>
+      <w:r>
+        <w:t>spacesAfter</w:t>
+      </w:r>
+      <w:proofErr w:type="spellEnd"/>
+      <w:r>
+        <w:t xml:space="preserve">. </w:t>
+      </w:r>
+      <w:proofErr w:type="gramStart"/>
+      <w:r>
+        <w:t>So</w:t>
+      </w:r>
+      <w:proofErr w:type="gramEnd"/>
+      <w:r>
+        <w:t xml:space="preserve"> I modified the comment.</w:t>
       </w:r>
     </w:p>
     <w:p>
@@ -2138,11 +2532,22 @@
     </w:p>
     <w:p>
       <w:r>
-        <w:t>I added a new attribute to the Typist class – justMistyped:</w:t>
-      </w:r>
-    </w:p>
-    <w:p>
-      <w:r>
+        <w:t xml:space="preserve">I added a new attribute to the Typist class – </w:t>
+      </w:r>
+      <w:proofErr w:type="spellStart"/>
+      <w:r>
+        <w:t>justMistyped</w:t>
+      </w:r>
+      <w:proofErr w:type="spellEnd"/>
+      <w:r>
+        <w:t>:</w:t>
+      </w:r>
+    </w:p>
+    <w:p>
+      <w:r>
+        <w:rPr>
+          <w:noProof/>
+        </w:rPr>
         <w:lastRenderedPageBreak/>
         <w:drawing>
           <wp:inline distT="0" distB="0" distL="0" distR="0" wp14:anchorId="31D14E2A" wp14:editId="45B07B3F">
@@ -2183,11 +2588,22 @@
     </w:p>
     <w:p>
       <w:r>
-        <w:t>I added a hasJustMistyped method:</w:t>
-      </w:r>
-    </w:p>
-    <w:p>
-      <w:r>
+        <w:t xml:space="preserve">I added a </w:t>
+      </w:r>
+      <w:proofErr w:type="spellStart"/>
+      <w:r>
+        <w:t>hasJustMistyped</w:t>
+      </w:r>
+      <w:proofErr w:type="spellEnd"/>
+      <w:r>
+        <w:t xml:space="preserve"> method:</w:t>
+      </w:r>
+    </w:p>
+    <w:p>
+      <w:r>
+        <w:rPr>
+          <w:noProof/>
+        </w:rPr>
         <w:drawing>
           <wp:inline distT="0" distB="0" distL="0" distR="0" wp14:anchorId="34CD4544" wp14:editId="1BB50971">
             <wp:extent cx="5731510" cy="2032635"/>
@@ -2238,6 +2654,9 @@
     </w:p>
     <w:p>
       <w:r>
+        <w:rPr>
+          <w:noProof/>
+        </w:rPr>
         <w:drawing>
           <wp:inline distT="0" distB="0" distL="0" distR="0" wp14:anchorId="49B90F96" wp14:editId="535828EA">
             <wp:extent cx="5731510" cy="1872615"/>
@@ -2277,11 +2696,30 @@
     </w:p>
     <w:p>
       <w:r>
-        <w:t>If the user mistypes (so if the slideBack method is called) then ‘justMistyped’ should be set to true:</w:t>
-      </w:r>
-    </w:p>
-    <w:p>
-      <w:r>
+        <w:t xml:space="preserve">If the user mistypes (so if the </w:t>
+      </w:r>
+      <w:proofErr w:type="spellStart"/>
+      <w:r>
+        <w:t>slideBack</w:t>
+      </w:r>
+      <w:proofErr w:type="spellEnd"/>
+      <w:r>
+        <w:t xml:space="preserve"> method is called) then ‘</w:t>
+      </w:r>
+      <w:proofErr w:type="spellStart"/>
+      <w:r>
+        <w:t>justMistyped</w:t>
+      </w:r>
+      <w:proofErr w:type="spellEnd"/>
+      <w:r>
+        <w:t>’ should be set to true:</w:t>
+      </w:r>
+    </w:p>
+    <w:p>
+      <w:r>
+        <w:rPr>
+          <w:noProof/>
+        </w:rPr>
         <w:lastRenderedPageBreak/>
         <w:drawing>
           <wp:inline distT="0" distB="0" distL="0" distR="0" wp14:anchorId="268A3583" wp14:editId="17E19660">
@@ -2322,11 +2760,46 @@
     </w:p>
     <w:p>
       <w:r>
-        <w:t>However, when they type normally again (when the advanceTypist method is called), then the value should be reset (set to false). Since advanceTypist is in the TypingRace class, it cannot access the justMistyped attribute directly, therefore I will need to create a method to reset the value to false.</w:t>
-      </w:r>
-    </w:p>
-    <w:p>
-      <w:r>
+        <w:t xml:space="preserve">However, when they type normally again (when the </w:t>
+      </w:r>
+      <w:proofErr w:type="spellStart"/>
+      <w:r>
+        <w:t>advanceTypist</w:t>
+      </w:r>
+      <w:proofErr w:type="spellEnd"/>
+      <w:r>
+        <w:t xml:space="preserve"> method is called), then the value should be reset (set to false). Since </w:t>
+      </w:r>
+      <w:proofErr w:type="spellStart"/>
+      <w:r>
+        <w:t>advanceTypist</w:t>
+      </w:r>
+      <w:proofErr w:type="spellEnd"/>
+      <w:r>
+        <w:t xml:space="preserve"> is in the </w:t>
+      </w:r>
+      <w:proofErr w:type="spellStart"/>
+      <w:r>
+        <w:t>TypingRace</w:t>
+      </w:r>
+      <w:proofErr w:type="spellEnd"/>
+      <w:r>
+        <w:t xml:space="preserve"> class, it cannot access the </w:t>
+      </w:r>
+      <w:proofErr w:type="spellStart"/>
+      <w:r>
+        <w:t>justMistyped</w:t>
+      </w:r>
+      <w:proofErr w:type="spellEnd"/>
+      <w:r>
+        <w:t xml:space="preserve"> attribute directly, therefore I will need to create a method to reset the value to false.</w:t>
+      </w:r>
+    </w:p>
+    <w:p>
+      <w:r>
+        <w:rPr>
+          <w:noProof/>
+        </w:rPr>
         <w:drawing>
           <wp:inline distT="0" distB="0" distL="0" distR="0" wp14:anchorId="41220D33" wp14:editId="6AED815D">
             <wp:extent cx="5731510" cy="1339850"/>
@@ -2366,6 +2839,9 @@
     </w:p>
     <w:p>
       <w:r>
+        <w:rPr>
+          <w:noProof/>
+        </w:rPr>
         <w:lastRenderedPageBreak/>
         <w:drawing>
           <wp:inline distT="0" distB="0" distL="0" distR="0" wp14:anchorId="69CC28FD" wp14:editId="1F7AE94F">
@@ -2411,6 +2887,9 @@
     </w:p>
     <w:p>
       <w:r>
+        <w:rPr>
+          <w:noProof/>
+        </w:rPr>
         <w:lastRenderedPageBreak/>
         <w:drawing>
           <wp:inline distT="0" distB="0" distL="0" distR="0" wp14:anchorId="7A569013" wp14:editId="199EF643">
@@ -2456,6 +2935,9 @@
         </w:pBdr>
       </w:pPr>
       <w:r>
+        <w:rPr>
+          <w:noProof/>
+        </w:rPr>
         <w:drawing>
           <wp:inline distT="0" distB="0" distL="0" distR="0" wp14:anchorId="25CA9901" wp14:editId="5921868D">
             <wp:extent cx="5731510" cy="3519170"/>
@@ -2522,6 +3004,9 @@
     </w:p>
     <w:p>
       <w:r>
+        <w:rPr>
+          <w:noProof/>
+        </w:rPr>
         <w:drawing>
           <wp:inline distT="0" distB="0" distL="0" distR="0" wp14:anchorId="54611AAE" wp14:editId="26E3DB43">
             <wp:extent cx="5731510" cy="916305"/>
@@ -2560,8 +3045,21 @@
       </w:r>
     </w:p>
     <w:p>
-      <w:r>
-        <w:t>So I have decided to use the DecimalFormat subclass to format the accuracy to 2 decimal places.</w:t>
+      <w:proofErr w:type="gramStart"/>
+      <w:r>
+        <w:t>So</w:t>
+      </w:r>
+      <w:proofErr w:type="gramEnd"/>
+      <w:r>
+        <w:t xml:space="preserve"> I have decided to use the </w:t>
+      </w:r>
+      <w:proofErr w:type="spellStart"/>
+      <w:r>
+        <w:t>DecimalFormat</w:t>
+      </w:r>
+      <w:proofErr w:type="spellEnd"/>
+      <w:r>
+        <w:t xml:space="preserve"> subclass to format the accuracy to 2 decimal places.</w:t>
       </w:r>
     </w:p>
     <w:p>
@@ -2571,6 +3069,9 @@
     </w:p>
     <w:p>
       <w:r>
+        <w:rPr>
+          <w:noProof/>
+        </w:rPr>
         <w:drawing>
           <wp:inline distT="0" distB="0" distL="0" distR="0" wp14:anchorId="63C0DF3F" wp14:editId="794161BA">
             <wp:extent cx="4115374" cy="381053"/>
@@ -2610,11 +3111,22 @@
     </w:p>
     <w:p>
       <w:r>
-        <w:t>And I created a new object of it at the beginning of the class so that it can be used throughout without having to define it everytime:</w:t>
-      </w:r>
-    </w:p>
-    <w:p>
-      <w:r>
+        <w:t xml:space="preserve">And I created a new object of it at the beginning of the class so that it can be used throughout without having to define it </w:t>
+      </w:r>
+      <w:proofErr w:type="spellStart"/>
+      <w:r>
+        <w:t>everytime</w:t>
+      </w:r>
+      <w:proofErr w:type="spellEnd"/>
+      <w:r>
+        <w:t>:</w:t>
+      </w:r>
+    </w:p>
+    <w:p>
+      <w:r>
+        <w:rPr>
+          <w:noProof/>
+        </w:rPr>
         <w:drawing>
           <wp:inline distT="0" distB="0" distL="0" distR="0" wp14:anchorId="2EBEBDDB" wp14:editId="6B5BD24A">
             <wp:extent cx="5731510" cy="2440940"/>
@@ -2659,6 +3171,9 @@
     </w:p>
     <w:p>
       <w:r>
+        <w:rPr>
+          <w:noProof/>
+        </w:rPr>
         <w:drawing>
           <wp:inline distT="0" distB="0" distL="0" distR="0" wp14:anchorId="484417E1" wp14:editId="0A7D61A5">
             <wp:extent cx="5731510" cy="1259840"/>
@@ -2697,12 +3212,107 @@
       </w:r>
     </w:p>
     <w:p>
+      <w:pPr>
+        <w:pBdr>
+          <w:bottom w:val="single" w:sz="6" w:space="1" w:color="auto"/>
+        </w:pBdr>
+      </w:pPr>
       <w:r>
         <w:t>But I do not round for calculations as this could lead to inaccurate calculations.</w:t>
       </w:r>
     </w:p>
+    <w:p/>
+    <w:p>
+      <w:r>
+        <w:drawing>
+          <wp:inline distT="0" distB="0" distL="0" distR="0" wp14:anchorId="530F4928" wp14:editId="61FCE26A">
+            <wp:extent cx="5731510" cy="3740150"/>
+            <wp:effectExtent l="0" t="0" r="2540" b="0"/>
+            <wp:docPr id="2053832278" name="Picture 1"/>
+            <wp:cNvGraphicFramePr>
+              <a:graphicFrameLocks xmlns:a="http://schemas.openxmlformats.org/drawingml/2006/main" noChangeAspect="1"/>
+            </wp:cNvGraphicFramePr>
+            <a:graphic xmlns:a="http://schemas.openxmlformats.org/drawingml/2006/main">
+              <a:graphicData uri="http://schemas.openxmlformats.org/drawingml/2006/picture">
+                <pic:pic xmlns:pic="http://schemas.openxmlformats.org/drawingml/2006/picture">
+                  <pic:nvPicPr>
+                    <pic:cNvPr id="2053832278" name=""/>
+                    <pic:cNvPicPr/>
+                  </pic:nvPicPr>
+                  <pic:blipFill>
+                    <a:blip r:embed="rId38"/>
+                    <a:stretch>
+                      <a:fillRect/>
+                    </a:stretch>
+                  </pic:blipFill>
+                  <pic:spPr>
+                    <a:xfrm>
+                      <a:off x="0" y="0"/>
+                      <a:ext cx="5731510" cy="3740150"/>
+                    </a:xfrm>
+                    <a:prstGeom prst="rect">
+                      <a:avLst/>
+                    </a:prstGeom>
+                  </pic:spPr>
+                </pic:pic>
+              </a:graphicData>
+            </a:graphic>
+          </wp:inline>
+        </w:drawing>
+      </w:r>
+    </w:p>
+    <w:p>
+      <w:r>
+        <w:t>A typist can type a character and mistype on a turn.</w:t>
+      </w:r>
+    </w:p>
+    <w:p>
+      <w:r>
+        <w:t>To fix this I changed the mistype to an else if statement:</w:t>
+      </w:r>
+    </w:p>
+    <w:p>
+      <w:r>
+        <w:drawing>
+          <wp:inline distT="0" distB="0" distL="0" distR="0" wp14:anchorId="5DD124AB" wp14:editId="4CDD0F5C">
+            <wp:extent cx="5731510" cy="3686175"/>
+            <wp:effectExtent l="0" t="0" r="2540" b="9525"/>
+            <wp:docPr id="407349350" name="Picture 1"/>
+            <wp:cNvGraphicFramePr>
+              <a:graphicFrameLocks xmlns:a="http://schemas.openxmlformats.org/drawingml/2006/main" noChangeAspect="1"/>
+            </wp:cNvGraphicFramePr>
+            <a:graphic xmlns:a="http://schemas.openxmlformats.org/drawingml/2006/main">
+              <a:graphicData uri="http://schemas.openxmlformats.org/drawingml/2006/picture">
+                <pic:pic xmlns:pic="http://schemas.openxmlformats.org/drawingml/2006/picture">
+                  <pic:nvPicPr>
+                    <pic:cNvPr id="407349350" name=""/>
+                    <pic:cNvPicPr/>
+                  </pic:nvPicPr>
+                  <pic:blipFill>
+                    <a:blip r:embed="rId39"/>
+                    <a:stretch>
+                      <a:fillRect/>
+                    </a:stretch>
+                  </pic:blipFill>
+                  <pic:spPr>
+                    <a:xfrm>
+                      <a:off x="0" y="0"/>
+                      <a:ext cx="5731510" cy="3686175"/>
+                    </a:xfrm>
+                    <a:prstGeom prst="rect">
+                      <a:avLst/>
+                    </a:prstGeom>
+                  </pic:spPr>
+                </pic:pic>
+              </a:graphicData>
+            </a:graphic>
+          </wp:inline>
+        </w:drawing>
+      </w:r>
+    </w:p>
+    <w:p/>
     <w:sectPr>
-      <w:headerReference w:type="default" r:id="rId38"/>
+      <w:headerReference w:type="default" r:id="rId40"/>
       <w:pgSz w:w="11906" w:h="16838"/>
       <w:pgMar w:top="1440" w:right="1440" w:bottom="1440" w:left="1440" w:header="708" w:footer="708" w:gutter="0"/>
       <w:cols w:space="708"/>

</xml_diff>